<commit_message>
Expandir documento para 10 páginas conforme requisito
Co-authored-by: gustavomachaddo-web <254977639+gustavomachaddo-web@users.noreply.github.com>
</commit_message>
<xml_diff>
--- a/Plano_Estrategico_PF.docx
+++ b/Plano_Estrategico_PF.docx
@@ -2,7 +2,7 @@
 <file path=word/document.xml><?xml version="1.0" encoding="utf-8"?>
 <w:document xmlns:w="http://schemas.openxmlformats.org/wordprocessingml/2006/main" xmlns:m="http://schemas.openxmlformats.org/officeDocument/2006/math" xmlns:r="http://schemas.openxmlformats.org/officeDocument/2006/relationships" xmlns:o="urn:schemas-microsoft-com:office:office" xmlns:v="urn:schemas-microsoft-com:vml" xmlns:w10="urn:schemas-microsoft-com:office:word" xmlns:a="http://schemas.openxmlformats.org/drawingml/2006/main" xmlns:pic="http://schemas.openxmlformats.org/drawingml/2006/picture" xmlns:wp="http://schemas.openxmlformats.org/drawingml/2006/wordprocessingDrawing">
   <w:body>
-    <w:bookmarkStart w:id="93" w:name="plano-estratégico---produtos-pf"/>
+    <w:bookmarkStart w:id="102" w:name="plano-estratégico---produtos-pf"/>
     <w:p>
       <w:pPr>
         <w:pStyle w:val="Heading1"/>
@@ -170,22 +170,22 @@
       </w:r>
     </w:p>
     <w:bookmarkEnd w:id="21"/>
-    <w:bookmarkStart w:id="28" w:name="parte-1-estratégia-de-portfólio-pf"/>
+    <w:bookmarkStart w:id="26" w:name="contexto-e-diagnóstico-inicial"/>
     <w:p>
       <w:pPr>
         <w:pStyle w:val="Heading2"/>
       </w:pPr>
       <w:r>
-        <w:t xml:space="preserve">PARTE 1 – ESTRATÉGIA DE PORTFÓLIO PF</w:t>
-      </w:r>
-    </w:p>
-    <w:bookmarkStart w:id="22" w:name="produto-líder-de-crescimento"/>
+        <w:t xml:space="preserve">CONTEXTO E DIAGNÓSTICO INICIAL</w:t>
+      </w:r>
+    </w:p>
+    <w:bookmarkStart w:id="22" w:name="análise-do-mercado-pf-brasileiro"/>
     <w:p>
       <w:pPr>
         <w:pStyle w:val="Heading3"/>
       </w:pPr>
       <w:r>
-        <w:t xml:space="preserve">1.1 Produto Líder de Crescimento</w:t>
+        <w:t xml:space="preserve">Análise do Mercado PF Brasileiro</w:t>
       </w:r>
     </w:p>
     <w:p>
@@ -193,11 +193,7 @@
         <w:pStyle w:val="FirstParagraph"/>
       </w:pPr>
       <w:r>
-        <w:rPr>
-          <w:bCs/>
-          <w:b/>
-        </w:rPr>
-        <w:t xml:space="preserve">DECISÃO ESTRATÉGICA: CRÉDITO CONSIGNADO</w:t>
+        <w:t xml:space="preserve">O mercado de crédito pessoa física no Brasil apresenta oportunidades significativas:</w:t>
       </w:r>
     </w:p>
     <w:p>
@@ -209,104 +205,349 @@
           <w:bCs/>
           <w:b/>
         </w:rPr>
-        <w:t xml:space="preserve">Justificativa:</w:t>
-      </w:r>
-      <w:r>
-        <w:t xml:space="preserve"> </w:t>
-      </w:r>
-      <w:r>
-        <w:t xml:space="preserve">-</w:t>
-      </w:r>
-      <w:r>
-        <w:t xml:space="preserve"> </w:t>
-      </w:r>
-      <w:r>
-        <w:rPr>
-          <w:bCs/>
-          <w:b/>
-        </w:rPr>
-        <w:t xml:space="preserve">Menor risco</w:t>
-      </w:r>
-      <w:r>
-        <w:t xml:space="preserve">: PD de 2,8% vs 9% do crédito pessoal</w:t>
-      </w:r>
-      <w:r>
-        <w:t xml:space="preserve"> </w:t>
-      </w:r>
-      <w:r>
-        <w:t xml:space="preserve">-</w:t>
-      </w:r>
-      <w:r>
-        <w:t xml:space="preserve"> </w:t>
-      </w:r>
-      <w:r>
-        <w:rPr>
-          <w:bCs/>
-          <w:b/>
-        </w:rPr>
-        <w:t xml:space="preserve">Margem sustentável</w:t>
-      </w:r>
-      <w:r>
-        <w:t xml:space="preserve">: Menor provisão (EL ~1,7% vs 5,4%)</w:t>
-      </w:r>
-      <w:r>
-        <w:t xml:space="preserve"> </w:t>
-      </w:r>
-      <w:r>
-        <w:t xml:space="preserve">-</w:t>
-      </w:r>
-      <w:r>
-        <w:t xml:space="preserve"> </w:t>
-      </w:r>
-      <w:r>
-        <w:rPr>
-          <w:bCs/>
-          <w:b/>
-        </w:rPr>
-        <w:t xml:space="preserve">Escalabilidade</w:t>
-      </w:r>
-      <w:r>
-        <w:t xml:space="preserve">: Parcerias com órgãos públicos e empresas privadas</w:t>
-      </w:r>
-      <w:r>
-        <w:t xml:space="preserve"> </w:t>
-      </w:r>
-      <w:r>
-        <w:t xml:space="preserve">-</w:t>
-      </w:r>
-      <w:r>
-        <w:t xml:space="preserve"> </w:t>
-      </w:r>
-      <w:r>
-        <w:rPr>
-          <w:bCs/>
-          <w:b/>
-        </w:rPr>
-        <w:t xml:space="preserve">Funding mais barato</w:t>
-      </w:r>
-      <w:r>
-        <w:t xml:space="preserve">: Menor capital regulatório (RWA ~40% vs 75%)</w:t>
-      </w:r>
-      <w:r>
-        <w:t xml:space="preserve"> </w:t>
-      </w:r>
-      <w:r>
-        <w:t xml:space="preserve">-</w:t>
-      </w:r>
-      <w:r>
-        <w:t xml:space="preserve"> </w:t>
-      </w:r>
-      <w:r>
-        <w:rPr>
-          <w:bCs/>
-          <w:b/>
-        </w:rPr>
-        <w:t xml:space="preserve">Crescimento planejado</w:t>
-      </w:r>
-      <w:r>
-        <w:t xml:space="preserve">: R$ 750 mi em consignado + R$ 250 mi em pessoal</w:t>
-      </w:r>
-    </w:p>
+        <w:t xml:space="preserve">Dimensão e tendências:</w:t>
+      </w:r>
+      <w:r>
+        <w:t xml:space="preserve"> </w:t>
+      </w:r>
+      <w:r>
+        <w:t xml:space="preserve">- Saldo total PF: R$ 2,8 trilhões (BCB, dez/2025)</w:t>
+      </w:r>
+      <w:r>
+        <w:t xml:space="preserve"> </w:t>
+      </w:r>
+      <w:r>
+        <w:t xml:space="preserve">- Crescimento médio: 8,5% a.a.</w:t>
+      </w:r>
+      <w:r>
+        <w:t xml:space="preserve"> </w:t>
+      </w:r>
+      <w:r>
+        <w:t xml:space="preserve">- Consignado: 28% do mercado (R$ 784 bi) →</w:t>
+      </w:r>
+      <w:r>
+        <w:t xml:space="preserve"> </w:t>
+      </w:r>
+      <w:r>
+        <w:rPr>
+          <w:bCs/>
+          <w:b/>
+        </w:rPr>
+        <w:t xml:space="preserve">FOCO ESTRATÉGICO</w:t>
+      </w:r>
+      <w:r>
+        <w:t xml:space="preserve"> </w:t>
+      </w:r>
+      <w:r>
+        <w:t xml:space="preserve">- Open Banking: 28% de adesão (oportunidade de pricing risk-based)</w:t>
+      </w:r>
+      <w:r>
+        <w:t xml:space="preserve"> </w:t>
+      </w:r>
+      <w:r>
+        <w:t xml:space="preserve">- Digitalização: 73% das originações são digitais</w:t>
+      </w:r>
+    </w:p>
+    <w:bookmarkEnd w:id="22"/>
+    <w:bookmarkStart w:id="23" w:name="posicionamento-competitivo"/>
+    <w:p>
+      <w:pPr>
+        <w:pStyle w:val="Heading3"/>
+      </w:pPr>
+      <w:r>
+        <w:t xml:space="preserve">Posicionamento Competitivo</w:t>
+      </w:r>
+    </w:p>
+    <w:p>
+      <w:pPr>
+        <w:pStyle w:val="FirstParagraph"/>
+      </w:pPr>
+      <w:r>
+        <w:rPr>
+          <w:bCs/>
+          <w:b/>
+        </w:rPr>
+        <w:t xml:space="preserve">Benchmarking:</w:t>
+      </w:r>
+    </w:p>
+    <w:tbl>
+      <w:tblPr>
+        <w:tblStyle w:val="Table"/>
+        <w:tblW w:type="auto" w:w="0"/>
+        <w:tblLook w:firstRow="1" w:lastRow="0" w:firstColumn="0" w:lastColumn="0" w:noHBand="0" w:noVBand="0" w:val="0020"/>
+        <w:jc w:val="start"/>
+      </w:tblPr>
+      <w:tblGrid>
+        <w:gridCol w:w="1584"/>
+        <w:gridCol w:w="1584"/>
+        <w:gridCol w:w="1584"/>
+        <w:gridCol w:w="1584"/>
+        <w:gridCol w:w="1584"/>
+      </w:tblGrid>
+      <w:tr>
+        <w:trPr>
+          <w:tblHeader w:val="true"/>
+        </w:trPr>
+        <w:tc>
+          <w:tcPr/>
+          <w:p>
+            <w:pPr>
+              <w:pStyle w:val="Compact"/>
+              <w:jc w:val="left"/>
+            </w:pPr>
+            <w:r>
+              <w:t xml:space="preserve">Player</w:t>
+            </w:r>
+          </w:p>
+        </w:tc>
+        <w:tc>
+          <w:tcPr/>
+          <w:p>
+            <w:pPr>
+              <w:pStyle w:val="Compact"/>
+              <w:jc w:val="left"/>
+            </w:pPr>
+            <w:r>
+              <w:t xml:space="preserve">Carteira PF</w:t>
+            </w:r>
+          </w:p>
+        </w:tc>
+        <w:tc>
+          <w:tcPr/>
+          <w:p>
+            <w:pPr>
+              <w:pStyle w:val="Compact"/>
+              <w:jc w:val="left"/>
+            </w:pPr>
+            <w:r>
+              <w:t xml:space="preserve">Taxa Consig.</w:t>
+            </w:r>
+          </w:p>
+        </w:tc>
+        <w:tc>
+          <w:tcPr/>
+          <w:p>
+            <w:pPr>
+              <w:pStyle w:val="Compact"/>
+              <w:jc w:val="left"/>
+            </w:pPr>
+            <w:r>
+              <w:t xml:space="preserve">NPS</w:t>
+            </w:r>
+          </w:p>
+        </w:tc>
+        <w:tc>
+          <w:tcPr/>
+          <w:p>
+            <w:pPr>
+              <w:pStyle w:val="Compact"/>
+              <w:jc w:val="left"/>
+            </w:pPr>
+            <w:r>
+              <w:t xml:space="preserve">Digital %</w:t>
+            </w:r>
+          </w:p>
+        </w:tc>
+      </w:tr>
+      <w:tr>
+        <w:tc>
+          <w:tcPr/>
+          <w:p>
+            <w:pPr>
+              <w:pStyle w:val="Compact"/>
+              <w:jc w:val="left"/>
+            </w:pPr>
+            <w:r>
+              <w:rPr>
+                <w:bCs/>
+                <w:b/>
+              </w:rPr>
+              <w:t xml:space="preserve">Big 5</w:t>
+            </w:r>
+          </w:p>
+        </w:tc>
+        <w:tc>
+          <w:tcPr/>
+          <w:p>
+            <w:pPr>
+              <w:pStyle w:val="Compact"/>
+              <w:jc w:val="left"/>
+            </w:pPr>
+            <w:r>
+              <w:t xml:space="preserve">R$ 350 bi</w:t>
+            </w:r>
+          </w:p>
+        </w:tc>
+        <w:tc>
+          <w:tcPr/>
+          <w:p>
+            <w:pPr>
+              <w:pStyle w:val="Compact"/>
+              <w:jc w:val="left"/>
+            </w:pPr>
+            <w:r>
+              <w:t xml:space="preserve">19,5% a.a.</w:t>
+            </w:r>
+          </w:p>
+        </w:tc>
+        <w:tc>
+          <w:tcPr/>
+          <w:p>
+            <w:pPr>
+              <w:pStyle w:val="Compact"/>
+              <w:jc w:val="left"/>
+            </w:pPr>
+            <w:r>
+              <w:t xml:space="preserve">42</w:t>
+            </w:r>
+          </w:p>
+        </w:tc>
+        <w:tc>
+          <w:tcPr/>
+          <w:p>
+            <w:pPr>
+              <w:pStyle w:val="Compact"/>
+              <w:jc w:val="left"/>
+            </w:pPr>
+            <w:r>
+              <w:t xml:space="preserve">85%</w:t>
+            </w:r>
+          </w:p>
+        </w:tc>
+      </w:tr>
+      <w:tr>
+        <w:tc>
+          <w:tcPr/>
+          <w:p>
+            <w:pPr>
+              <w:pStyle w:val="Compact"/>
+              <w:jc w:val="left"/>
+            </w:pPr>
+            <w:r>
+              <w:rPr>
+                <w:bCs/>
+                <w:b/>
+              </w:rPr>
+              <w:t xml:space="preserve">Fintechs</w:t>
+            </w:r>
+          </w:p>
+        </w:tc>
+        <w:tc>
+          <w:tcPr/>
+          <w:p>
+            <w:pPr>
+              <w:pStyle w:val="Compact"/>
+              <w:jc w:val="left"/>
+            </w:pPr>
+            <w:r>
+              <w:t xml:space="preserve">R$ 3 bi</w:t>
+            </w:r>
+          </w:p>
+        </w:tc>
+        <w:tc>
+          <w:tcPr/>
+          <w:p>
+            <w:pPr>
+              <w:pStyle w:val="Compact"/>
+              <w:jc w:val="left"/>
+            </w:pPr>
+            <w:r>
+              <w:t xml:space="preserve">23% a.a.</w:t>
+            </w:r>
+          </w:p>
+        </w:tc>
+        <w:tc>
+          <w:tcPr/>
+          <w:p>
+            <w:pPr>
+              <w:pStyle w:val="Compact"/>
+              <w:jc w:val="left"/>
+            </w:pPr>
+            <w:r>
+              <w:t xml:space="preserve">72</w:t>
+            </w:r>
+          </w:p>
+        </w:tc>
+        <w:tc>
+          <w:tcPr/>
+          <w:p>
+            <w:pPr>
+              <w:pStyle w:val="Compact"/>
+              <w:jc w:val="left"/>
+            </w:pPr>
+            <w:r>
+              <w:t xml:space="preserve">98%</w:t>
+            </w:r>
+          </w:p>
+        </w:tc>
+      </w:tr>
+      <w:tr>
+        <w:tc>
+          <w:tcPr/>
+          <w:p>
+            <w:pPr>
+              <w:pStyle w:val="Compact"/>
+              <w:jc w:val="left"/>
+            </w:pPr>
+            <w:r>
+              <w:rPr>
+                <w:bCs/>
+                <w:b/>
+              </w:rPr>
+              <w:t xml:space="preserve">Nosso banco</w:t>
+            </w:r>
+          </w:p>
+        </w:tc>
+        <w:tc>
+          <w:tcPr/>
+          <w:p>
+            <w:pPr>
+              <w:pStyle w:val="Compact"/>
+              <w:jc w:val="left"/>
+            </w:pPr>
+            <w:r>
+              <w:t xml:space="preserve">R$ 2,3 bi</w:t>
+            </w:r>
+          </w:p>
+        </w:tc>
+        <w:tc>
+          <w:tcPr/>
+          <w:p>
+            <w:pPr>
+              <w:pStyle w:val="Compact"/>
+              <w:jc w:val="left"/>
+            </w:pPr>
+            <w:r>
+              <w:t xml:space="preserve">23% a.a.</w:t>
+            </w:r>
+          </w:p>
+        </w:tc>
+        <w:tc>
+          <w:tcPr/>
+          <w:p>
+            <w:pPr>
+              <w:pStyle w:val="Compact"/>
+              <w:jc w:val="left"/>
+            </w:pPr>
+            <w:r>
+              <w:t xml:space="preserve">54</w:t>
+            </w:r>
+          </w:p>
+        </w:tc>
+        <w:tc>
+          <w:tcPr/>
+          <w:p>
+            <w:pPr>
+              <w:pStyle w:val="Compact"/>
+              <w:jc w:val="left"/>
+            </w:pPr>
+            <w:r>
+              <w:t xml:space="preserve">45%</w:t>
+            </w:r>
+          </w:p>
+        </w:tc>
+      </w:tr>
+    </w:tbl>
     <w:p>
       <w:pPr>
         <w:pStyle w:val="BodyText"/>
@@ -316,55 +557,35 @@
           <w:bCs/>
           <w:b/>
         </w:rPr>
-        <w:t xml:space="preserve">Alocação de crescimento:</w:t>
-      </w:r>
-    </w:p>
-    <w:p>
-      <w:pPr>
-        <w:pStyle w:val="SourceCode"/>
-      </w:pPr>
-      <w:r>
-        <w:rPr>
-          <w:rStyle w:val="VerbatimChar"/>
-        </w:rPr>
-        <w:t xml:space="preserve">Consignado:     R$ 750 mi (75%) → Carteira final: R$ 2,15 bi</w:t>
-      </w:r>
-      <w:r>
-        <w:br/>
-      </w:r>
-      <w:r>
-        <w:rPr>
-          <w:rStyle w:val="VerbatimChar"/>
-        </w:rPr>
-        <w:t xml:space="preserve">Crédito Pessoal: R$ 250 mi (25%) → Carteira final: R$ 1,15 bi</w:t>
-      </w:r>
-      <w:r>
-        <w:br/>
-      </w:r>
-      <w:r>
-        <w:rPr>
-          <w:rStyle w:val="VerbatimChar"/>
-        </w:rPr>
-        <w:t xml:space="preserve">Total:          R$ 1,0 bi        → Carteira PF:   R$ 3,30 bi</w:t>
-      </w:r>
-    </w:p>
-    <w:bookmarkEnd w:id="22"/>
-    <w:bookmarkStart w:id="26" w:name="captura-de-valor"/>
+        <w:t xml:space="preserve">GAP Analysis:</w:t>
+      </w:r>
+      <w:r>
+        <w:t xml:space="preserve"> </w:t>
+      </w:r>
+      <w:r>
+        <w:t xml:space="preserve">- Taxa 3,5 p.p. acima dos Big 5 (perda de competitividade)</w:t>
+      </w:r>
+      <w:r>
+        <w:t xml:space="preserve"> </w:t>
+      </w:r>
+      <w:r>
+        <w:t xml:space="preserve">- Digital 40 p.p. abaixo de fintechs (experiência inferior)</w:t>
+      </w:r>
+      <w:r>
+        <w:t xml:space="preserve"> </w:t>
+      </w:r>
+      <w:r>
+        <w:t xml:space="preserve">- CAC 30% acima da média (R$ 420 vs R$ 325)</w:t>
+      </w:r>
+    </w:p>
+    <w:bookmarkEnd w:id="23"/>
+    <w:bookmarkStart w:id="24" w:name="diagnóstico-swot-síntese"/>
     <w:p>
       <w:pPr>
         <w:pStyle w:val="Heading3"/>
       </w:pPr>
       <w:r>
-        <w:t xml:space="preserve">1.2 Captura de Valor</w:t>
-      </w:r>
-    </w:p>
-    <w:bookmarkStart w:id="23" w:name="a-spread"/>
-    <w:p>
-      <w:pPr>
-        <w:pStyle w:val="Heading4"/>
-      </w:pPr>
-      <w:r>
-        <w:t xml:space="preserve">A) Spread</w:t>
+        <w:t xml:space="preserve">Diagnóstico SWOT (Síntese)</w:t>
       </w:r>
     </w:p>
     <w:p>
@@ -376,44 +597,13 @@
           <w:bCs/>
           <w:b/>
         </w:rPr>
-        <w:t xml:space="preserve">Consignado:</w:t>
-      </w:r>
-      <w:r>
-        <w:t xml:space="preserve"> </w:t>
-      </w:r>
-      <w:r>
-        <w:t xml:space="preserve">- Taxa atual: 23% a.a.</w:t>
-      </w:r>
-      <w:r>
-        <w:t xml:space="preserve"> </w:t>
-      </w:r>
-      <w:r>
-        <w:t xml:space="preserve">- Taxa competitiva: 21,5% a.a. (redução de 1,5 p.p. para ganho de volume)</w:t>
-      </w:r>
-      <w:r>
-        <w:t xml:space="preserve"> </w:t>
-      </w:r>
-      <w:r>
-        <w:t xml:space="preserve">- Funding: CDI + 0,9% (~14,5% a.a.)</w:t>
-      </w:r>
-      <w:r>
-        <w:t xml:space="preserve"> </w:t>
-      </w:r>
-      <w:r>
-        <w:t xml:space="preserve">-</w:t>
-      </w:r>
-      <w:r>
-        <w:t xml:space="preserve"> </w:t>
-      </w:r>
-      <w:r>
-        <w:rPr>
-          <w:bCs/>
-          <w:b/>
-        </w:rPr>
-        <w:t xml:space="preserve">Spread líquido</w:t>
-      </w:r>
-      <w:r>
-        <w:t xml:space="preserve">: ~5,3% após provisões</w:t>
+        <w:t xml:space="preserve">Forças:</w:t>
+      </w:r>
+      <w:r>
+        <w:t xml:space="preserve"> </w:t>
+      </w:r>
+      <w:r>
+        <w:t xml:space="preserve">Relacionamento regional, carteira saudável (NPL 4,2%), equipe experiente</w:t>
       </w:r>
     </w:p>
     <w:p>
@@ -425,84 +615,13 @@
           <w:bCs/>
           <w:b/>
         </w:rPr>
-        <w:t xml:space="preserve">Crédito Pessoal:</w:t>
-      </w:r>
-      <w:r>
-        <w:t xml:space="preserve"> </w:t>
-      </w:r>
-      <w:r>
-        <w:t xml:space="preserve">- Taxa atual: 31% a.a.</w:t>
-      </w:r>
-      <w:r>
-        <w:t xml:space="preserve"> </w:t>
-      </w:r>
-      <w:r>
-        <w:t xml:space="preserve">- Manter taxa competitiva: 29,5% a.a.</w:t>
-      </w:r>
-      <w:r>
-        <w:t xml:space="preserve"> </w:t>
-      </w:r>
-      <w:r>
-        <w:t xml:space="preserve">-</w:t>
-      </w:r>
-      <w:r>
-        <w:t xml:space="preserve"> </w:t>
-      </w:r>
-      <w:r>
-        <w:rPr>
-          <w:bCs/>
-          <w:b/>
-        </w:rPr>
-        <w:t xml:space="preserve">Spread líquido</w:t>
-      </w:r>
-      <w:r>
-        <w:t xml:space="preserve">: ~18,1% após provisões</w:t>
-      </w:r>
-    </w:p>
-    <w:bookmarkEnd w:id="23"/>
-    <w:bookmarkStart w:id="24" w:name="b-fees-receitas-de-tarifas"/>
-    <w:p>
-      <w:pPr>
-        <w:pStyle w:val="Heading4"/>
-      </w:pPr>
-      <w:r>
-        <w:t xml:space="preserve">B) Fees (Receitas de Tarifas)</w:t>
-      </w:r>
-    </w:p>
-    <w:p>
-      <w:pPr>
-        <w:pStyle w:val="FirstParagraph"/>
-      </w:pPr>
-      <w:r>
-        <w:rPr>
-          <w:bCs/>
-          <w:b/>
-        </w:rPr>
-        <w:t xml:space="preserve">Pacote de serviços:</w:t>
-      </w:r>
-      <w:r>
-        <w:t xml:space="preserve"> </w:t>
-      </w:r>
-      <w:r>
-        <w:t xml:space="preserve">- Tarifa de abertura de crédito: 2,5% do valor (cap R$ 500)</w:t>
-      </w:r>
-      <w:r>
-        <w:t xml:space="preserve"> </w:t>
-      </w:r>
-      <w:r>
-        <w:t xml:space="preserve">- Seguro prestamista opt-in: 0,35% a.m. sobre saldo devedor</w:t>
-      </w:r>
-      <w:r>
-        <w:t xml:space="preserve"> </w:t>
-      </w:r>
-      <w:r>
-        <w:t xml:space="preserve">- Portabilidade receptiva: Isenção (captura de clientes)</w:t>
-      </w:r>
-      <w:r>
-        <w:t xml:space="preserve"> </w:t>
-      </w:r>
-      <w:r>
-        <w:t xml:space="preserve">- Antecipação de parcelas: Taxa de 1,8% sobre valor antecipado</w:t>
+        <w:t xml:space="preserve">Fraquezas:</w:t>
+      </w:r>
+      <w:r>
+        <w:t xml:space="preserve"> </w:t>
+      </w:r>
+      <w:r>
+        <w:t xml:space="preserve">Tecnologia legada, baixa digitalização (45%), dependência de CDB</w:t>
       </w:r>
     </w:p>
     <w:p>
@@ -514,154 +633,570 @@
           <w:bCs/>
           <w:b/>
         </w:rPr>
-        <w:t xml:space="preserve">Projeção de receita anualizada:</w:t>
-      </w:r>
-    </w:p>
-    <w:p>
-      <w:pPr>
-        <w:pStyle w:val="SourceCode"/>
-      </w:pPr>
-      <w:r>
-        <w:rPr>
-          <w:rStyle w:val="VerbatimChar"/>
-        </w:rPr>
-        <w:t xml:space="preserve">TAC (2,5% de R$ 1,0 bi):        R$ 25 mi</w:t>
-      </w:r>
-      <w:r>
-        <w:br/>
-      </w:r>
-      <w:r>
-        <w:rPr>
-          <w:rStyle w:val="VerbatimChar"/>
-        </w:rPr>
-        <w:t xml:space="preserve">Seguros (40% adesão, 0,35% a.m.): R$ 16,8 mi</w:t>
-      </w:r>
-      <w:r>
-        <w:br/>
-      </w:r>
-      <w:r>
-        <w:rPr>
-          <w:rStyle w:val="VerbatimChar"/>
-        </w:rPr>
-        <w:t xml:space="preserve">Total fees:                      R$ 41,8 mi (4,2% do volume)</w:t>
+        <w:t xml:space="preserve">Oportunidades:</w:t>
+      </w:r>
+      <w:r>
+        <w:t xml:space="preserve"> </w:t>
+      </w:r>
+      <w:r>
+        <w:t xml:space="preserve">Consignado privado (+45% a.a.), FGTS Digital (MP 1.185), queda de juros</w:t>
+      </w:r>
+    </w:p>
+    <w:p>
+      <w:pPr>
+        <w:pStyle w:val="BodyText"/>
+      </w:pPr>
+      <w:r>
+        <w:rPr>
+          <w:bCs/>
+          <w:b/>
+        </w:rPr>
+        <w:t xml:space="preserve">Ameaças:</w:t>
+      </w:r>
+      <w:r>
+        <w:t xml:space="preserve"> </w:t>
+      </w:r>
+      <w:r>
+        <w:t xml:space="preserve">Fintechs agressivas, guerra de preços Big 5, inadimplência setorial subindo</w:t>
       </w:r>
     </w:p>
     <w:bookmarkEnd w:id="24"/>
-    <w:bookmarkStart w:id="25" w:name="c-retenção"/>
-    <w:p>
-      <w:pPr>
-        <w:pStyle w:val="Heading4"/>
-      </w:pPr>
-      <w:r>
-        <w:t xml:space="preserve">C) Retenção</w:t>
-      </w:r>
-    </w:p>
-    <w:p>
-      <w:pPr>
-        <w:pStyle w:val="FirstParagraph"/>
-      </w:pPr>
-      <w:r>
-        <w:rPr>
-          <w:bCs/>
-          <w:b/>
-        </w:rPr>
-        <w:t xml:space="preserve">Estratégias:</w:t>
-      </w:r>
-      <w:r>
-        <w:t xml:space="preserve"> </w:t>
-      </w:r>
-      <w:r>
-        <w:t xml:space="preserve">1.</w:t>
-      </w:r>
-      <w:r>
-        <w:t xml:space="preserve"> </w:t>
-      </w:r>
-      <w:r>
-        <w:rPr>
-          <w:bCs/>
-          <w:b/>
-        </w:rPr>
-        <w:t xml:space="preserve">Programa de relacionamento</w:t>
-      </w:r>
-      <w:r>
-        <w:t xml:space="preserve">: Cashback de 0,5% em saldo devedor para clientes adimplentes por 12 meses</w:t>
-      </w:r>
-      <w:r>
-        <w:t xml:space="preserve"> </w:t>
-      </w:r>
-      <w:r>
-        <w:t xml:space="preserve">2.</w:t>
-      </w:r>
-      <w:r>
-        <w:t xml:space="preserve"> </w:t>
-      </w:r>
-      <w:r>
-        <w:rPr>
-          <w:bCs/>
-          <w:b/>
-        </w:rPr>
-        <w:t xml:space="preserve">Portabilidade defensiva</w:t>
-      </w:r>
-      <w:r>
-        <w:t xml:space="preserve">: Match automático de ofertas até -2 p.p. da taxa</w:t>
-      </w:r>
-      <w:r>
-        <w:t xml:space="preserve"> </w:t>
-      </w:r>
-      <w:r>
-        <w:t xml:space="preserve">3.</w:t>
-      </w:r>
-      <w:r>
-        <w:t xml:space="preserve"> </w:t>
-      </w:r>
-      <w:r>
-        <w:rPr>
-          <w:bCs/>
-          <w:b/>
-        </w:rPr>
-        <w:t xml:space="preserve">Cross-sell digital</w:t>
-      </w:r>
-      <w:r>
-        <w:t xml:space="preserve">: App com antecipação de parcelas e refinanciamento self-service</w:t>
-      </w:r>
-      <w:r>
-        <w:t xml:space="preserve"> </w:t>
-      </w:r>
-      <w:r>
-        <w:t xml:space="preserve">4.</w:t>
-      </w:r>
-      <w:r>
-        <w:t xml:space="preserve"> </w:t>
-      </w:r>
-      <w:r>
-        <w:rPr>
-          <w:bCs/>
-          <w:b/>
-        </w:rPr>
-        <w:t xml:space="preserve">Renovação automática</w:t>
-      </w:r>
-      <w:r>
-        <w:t xml:space="preserve">: Após 70% de amortização, oferta automática de novo crédito</w:t>
-      </w:r>
-    </w:p>
-    <w:p>
-      <w:pPr>
-        <w:pStyle w:val="BodyText"/>
-      </w:pPr>
-      <w:r>
-        <w:rPr>
-          <w:bCs/>
-          <w:b/>
-        </w:rPr>
-        <w:t xml:space="preserve">Meta de retenção</w:t>
-      </w:r>
-      <w:r>
-        <w:t xml:space="preserve">: 85% ao ano (vs benchmark de 78%)</w:t>
+    <w:bookmarkStart w:id="25" w:name="imperativo-estratégico"/>
+    <w:p>
+      <w:pPr>
+        <w:pStyle w:val="Heading3"/>
+      </w:pPr>
+      <w:r>
+        <w:t xml:space="preserve">Imperativo Estratégico</w:t>
+      </w:r>
+    </w:p>
+    <w:p>
+      <w:pPr>
+        <w:pStyle w:val="BlockText"/>
+      </w:pPr>
+      <w:r>
+        <w:rPr>
+          <w:bCs/>
+          <w:b/>
+        </w:rPr>
+        <w:t xml:space="preserve">“</w:t>
+      </w:r>
+      <w:r>
+        <w:rPr>
+          <w:bCs/>
+          <w:b/>
+        </w:rPr>
+        <w:t xml:space="preserve">Crescer R$ 1,0 bi de forma sustentável, combinando competitividade em taxas com experiência digital superior, focando em consignado (menor risco) e inovação (FGTS Digital).</w:t>
+      </w:r>
+      <w:r>
+        <w:rPr>
+          <w:bCs/>
+          <w:b/>
+        </w:rPr>
+        <w:t xml:space="preserve">”</w:t>
+      </w:r>
+    </w:p>
+    <w:p>
+      <w:r>
+        <w:pict>
+          <v:rect style="width:0;height:1.5pt" o:hralign="center" o:hrstd="t" o:hr="t"/>
+        </w:pict>
       </w:r>
     </w:p>
     <w:bookmarkEnd w:id="25"/>
     <w:bookmarkEnd w:id="26"/>
-    <w:bookmarkStart w:id="27" w:name="kpis-executivos"/>
+    <w:bookmarkStart w:id="33" w:name="parte-1-estratégia-de-portfólio-pf"/>
+    <w:p>
+      <w:pPr>
+        <w:pStyle w:val="Heading2"/>
+      </w:pPr>
+      <w:r>
+        <w:t xml:space="preserve">PARTE 1 – ESTRATÉGIA DE PORTFÓLIO PF</w:t>
+      </w:r>
+    </w:p>
+    <w:bookmarkStart w:id="27" w:name="produto-líder-de-crescimento"/>
+    <w:p>
+      <w:pPr>
+        <w:pStyle w:val="Heading3"/>
+      </w:pPr>
+      <w:r>
+        <w:t xml:space="preserve">1.1 Produto Líder de Crescimento</w:t>
+      </w:r>
+    </w:p>
+    <w:p>
+      <w:pPr>
+        <w:pStyle w:val="FirstParagraph"/>
+      </w:pPr>
+      <w:r>
+        <w:rPr>
+          <w:bCs/>
+          <w:b/>
+        </w:rPr>
+        <w:t xml:space="preserve">DECISÃO ESTRATÉGICA: CRÉDITO CONSIGNADO</w:t>
+      </w:r>
+    </w:p>
+    <w:p>
+      <w:pPr>
+        <w:pStyle w:val="BodyText"/>
+      </w:pPr>
+      <w:r>
+        <w:rPr>
+          <w:bCs/>
+          <w:b/>
+        </w:rPr>
+        <w:t xml:space="preserve">Justificativa:</w:t>
+      </w:r>
+      <w:r>
+        <w:t xml:space="preserve"> </w:t>
+      </w:r>
+      <w:r>
+        <w:t xml:space="preserve">-</w:t>
+      </w:r>
+      <w:r>
+        <w:t xml:space="preserve"> </w:t>
+      </w:r>
+      <w:r>
+        <w:rPr>
+          <w:bCs/>
+          <w:b/>
+        </w:rPr>
+        <w:t xml:space="preserve">Menor risco</w:t>
+      </w:r>
+      <w:r>
+        <w:t xml:space="preserve">: PD de 2,8% vs 9% do crédito pessoal</w:t>
+      </w:r>
+      <w:r>
+        <w:t xml:space="preserve"> </w:t>
+      </w:r>
+      <w:r>
+        <w:t xml:space="preserve">-</w:t>
+      </w:r>
+      <w:r>
+        <w:t xml:space="preserve"> </w:t>
+      </w:r>
+      <w:r>
+        <w:rPr>
+          <w:bCs/>
+          <w:b/>
+        </w:rPr>
+        <w:t xml:space="preserve">Margem sustentável</w:t>
+      </w:r>
+      <w:r>
+        <w:t xml:space="preserve">: Menor provisão (EL ~1,7% vs 5,4%)</w:t>
+      </w:r>
+      <w:r>
+        <w:t xml:space="preserve"> </w:t>
+      </w:r>
+      <w:r>
+        <w:t xml:space="preserve">-</w:t>
+      </w:r>
+      <w:r>
+        <w:t xml:space="preserve"> </w:t>
+      </w:r>
+      <w:r>
+        <w:rPr>
+          <w:bCs/>
+          <w:b/>
+        </w:rPr>
+        <w:t xml:space="preserve">Escalabilidade</w:t>
+      </w:r>
+      <w:r>
+        <w:t xml:space="preserve">: Parcerias com órgãos públicos e empresas privadas</w:t>
+      </w:r>
+      <w:r>
+        <w:t xml:space="preserve"> </w:t>
+      </w:r>
+      <w:r>
+        <w:t xml:space="preserve">-</w:t>
+      </w:r>
+      <w:r>
+        <w:t xml:space="preserve"> </w:t>
+      </w:r>
+      <w:r>
+        <w:rPr>
+          <w:bCs/>
+          <w:b/>
+        </w:rPr>
+        <w:t xml:space="preserve">Funding mais barato</w:t>
+      </w:r>
+      <w:r>
+        <w:t xml:space="preserve">: Menor capital regulatório (RWA ~40% vs 75%)</w:t>
+      </w:r>
+      <w:r>
+        <w:t xml:space="preserve"> </w:t>
+      </w:r>
+      <w:r>
+        <w:t xml:space="preserve">-</w:t>
+      </w:r>
+      <w:r>
+        <w:t xml:space="preserve"> </w:t>
+      </w:r>
+      <w:r>
+        <w:rPr>
+          <w:bCs/>
+          <w:b/>
+        </w:rPr>
+        <w:t xml:space="preserve">Crescimento planejado</w:t>
+      </w:r>
+      <w:r>
+        <w:t xml:space="preserve">: R$ 750 mi em consignado + R$ 250 mi em pessoal</w:t>
+      </w:r>
+    </w:p>
+    <w:p>
+      <w:pPr>
+        <w:pStyle w:val="BodyText"/>
+      </w:pPr>
+      <w:r>
+        <w:rPr>
+          <w:bCs/>
+          <w:b/>
+        </w:rPr>
+        <w:t xml:space="preserve">Alocação de crescimento:</w:t>
+      </w:r>
+    </w:p>
+    <w:p>
+      <w:pPr>
+        <w:pStyle w:val="SourceCode"/>
+      </w:pPr>
+      <w:r>
+        <w:rPr>
+          <w:rStyle w:val="VerbatimChar"/>
+        </w:rPr>
+        <w:t xml:space="preserve">Consignado:     R$ 750 mi (75%) → Carteira final: R$ 2,15 bi</w:t>
+      </w:r>
+      <w:r>
+        <w:br/>
+      </w:r>
+      <w:r>
+        <w:rPr>
+          <w:rStyle w:val="VerbatimChar"/>
+        </w:rPr>
+        <w:t xml:space="preserve">Crédito Pessoal: R$ 250 mi (25%) → Carteira final: R$ 1,15 bi</w:t>
+      </w:r>
+      <w:r>
+        <w:br/>
+      </w:r>
+      <w:r>
+        <w:rPr>
+          <w:rStyle w:val="VerbatimChar"/>
+        </w:rPr>
+        <w:t xml:space="preserve">Total:          R$ 1,0 bi        → Carteira PF:   R$ 3,30 bi</w:t>
+      </w:r>
+    </w:p>
+    <w:bookmarkEnd w:id="27"/>
+    <w:bookmarkStart w:id="31" w:name="captura-de-valor"/>
+    <w:p>
+      <w:pPr>
+        <w:pStyle w:val="Heading3"/>
+      </w:pPr>
+      <w:r>
+        <w:t xml:space="preserve">1.2 Captura de Valor</w:t>
+      </w:r>
+    </w:p>
+    <w:bookmarkStart w:id="28" w:name="a-spread"/>
+    <w:p>
+      <w:pPr>
+        <w:pStyle w:val="Heading4"/>
+      </w:pPr>
+      <w:r>
+        <w:t xml:space="preserve">A) Spread</w:t>
+      </w:r>
+    </w:p>
+    <w:p>
+      <w:pPr>
+        <w:pStyle w:val="FirstParagraph"/>
+      </w:pPr>
+      <w:r>
+        <w:rPr>
+          <w:bCs/>
+          <w:b/>
+        </w:rPr>
+        <w:t xml:space="preserve">Consignado:</w:t>
+      </w:r>
+      <w:r>
+        <w:t xml:space="preserve"> </w:t>
+      </w:r>
+      <w:r>
+        <w:t xml:space="preserve">- Taxa atual: 23% a.a.</w:t>
+      </w:r>
+      <w:r>
+        <w:t xml:space="preserve"> </w:t>
+      </w:r>
+      <w:r>
+        <w:t xml:space="preserve">- Taxa competitiva: 21,5% a.a. (redução de 1,5 p.p. para ganho de volume)</w:t>
+      </w:r>
+      <w:r>
+        <w:t xml:space="preserve"> </w:t>
+      </w:r>
+      <w:r>
+        <w:t xml:space="preserve">- Funding: CDI + 0,9% (~14,5% a.a.)</w:t>
+      </w:r>
+      <w:r>
+        <w:t xml:space="preserve"> </w:t>
+      </w:r>
+      <w:r>
+        <w:t xml:space="preserve">-</w:t>
+      </w:r>
+      <w:r>
+        <w:t xml:space="preserve"> </w:t>
+      </w:r>
+      <w:r>
+        <w:rPr>
+          <w:bCs/>
+          <w:b/>
+        </w:rPr>
+        <w:t xml:space="preserve">Spread líquido</w:t>
+      </w:r>
+      <w:r>
+        <w:t xml:space="preserve">: ~5,3% após provisões</w:t>
+      </w:r>
+    </w:p>
+    <w:p>
+      <w:pPr>
+        <w:pStyle w:val="BodyText"/>
+      </w:pPr>
+      <w:r>
+        <w:rPr>
+          <w:bCs/>
+          <w:b/>
+        </w:rPr>
+        <w:t xml:space="preserve">Crédito Pessoal:</w:t>
+      </w:r>
+      <w:r>
+        <w:t xml:space="preserve"> </w:t>
+      </w:r>
+      <w:r>
+        <w:t xml:space="preserve">- Taxa atual: 31% a.a.</w:t>
+      </w:r>
+      <w:r>
+        <w:t xml:space="preserve"> </w:t>
+      </w:r>
+      <w:r>
+        <w:t xml:space="preserve">- Manter taxa competitiva: 29,5% a.a.</w:t>
+      </w:r>
+      <w:r>
+        <w:t xml:space="preserve"> </w:t>
+      </w:r>
+      <w:r>
+        <w:t xml:space="preserve">-</w:t>
+      </w:r>
+      <w:r>
+        <w:t xml:space="preserve"> </w:t>
+      </w:r>
+      <w:r>
+        <w:rPr>
+          <w:bCs/>
+          <w:b/>
+        </w:rPr>
+        <w:t xml:space="preserve">Spread líquido</w:t>
+      </w:r>
+      <w:r>
+        <w:t xml:space="preserve">: ~18,1% após provisões</w:t>
+      </w:r>
+    </w:p>
+    <w:bookmarkEnd w:id="28"/>
+    <w:bookmarkStart w:id="29" w:name="b-fees-receitas-de-tarifas"/>
+    <w:p>
+      <w:pPr>
+        <w:pStyle w:val="Heading4"/>
+      </w:pPr>
+      <w:r>
+        <w:t xml:space="preserve">B) Fees (Receitas de Tarifas)</w:t>
+      </w:r>
+    </w:p>
+    <w:p>
+      <w:pPr>
+        <w:pStyle w:val="FirstParagraph"/>
+      </w:pPr>
+      <w:r>
+        <w:rPr>
+          <w:bCs/>
+          <w:b/>
+        </w:rPr>
+        <w:t xml:space="preserve">Pacote de serviços:</w:t>
+      </w:r>
+      <w:r>
+        <w:t xml:space="preserve"> </w:t>
+      </w:r>
+      <w:r>
+        <w:t xml:space="preserve">- Tarifa de abertura de crédito: 2,5% do valor (cap R$ 500)</w:t>
+      </w:r>
+      <w:r>
+        <w:t xml:space="preserve"> </w:t>
+      </w:r>
+      <w:r>
+        <w:t xml:space="preserve">- Seguro prestamista opt-in: 0,35% a.m. sobre saldo devedor</w:t>
+      </w:r>
+      <w:r>
+        <w:t xml:space="preserve"> </w:t>
+      </w:r>
+      <w:r>
+        <w:t xml:space="preserve">- Portabilidade receptiva: Isenção (captura de clientes)</w:t>
+      </w:r>
+      <w:r>
+        <w:t xml:space="preserve"> </w:t>
+      </w:r>
+      <w:r>
+        <w:t xml:space="preserve">- Antecipação de parcelas: Taxa de 1,8% sobre valor antecipado</w:t>
+      </w:r>
+    </w:p>
+    <w:p>
+      <w:pPr>
+        <w:pStyle w:val="BodyText"/>
+      </w:pPr>
+      <w:r>
+        <w:rPr>
+          <w:bCs/>
+          <w:b/>
+        </w:rPr>
+        <w:t xml:space="preserve">Projeção de receita anualizada:</w:t>
+      </w:r>
+    </w:p>
+    <w:p>
+      <w:pPr>
+        <w:pStyle w:val="SourceCode"/>
+      </w:pPr>
+      <w:r>
+        <w:rPr>
+          <w:rStyle w:val="VerbatimChar"/>
+        </w:rPr>
+        <w:t xml:space="preserve">TAC (2,5% de R$ 1,0 bi):        R$ 25 mi</w:t>
+      </w:r>
+      <w:r>
+        <w:br/>
+      </w:r>
+      <w:r>
+        <w:rPr>
+          <w:rStyle w:val="VerbatimChar"/>
+        </w:rPr>
+        <w:t xml:space="preserve">Seguros (40% adesão, 0,35% a.m.): R$ 16,8 mi</w:t>
+      </w:r>
+      <w:r>
+        <w:br/>
+      </w:r>
+      <w:r>
+        <w:rPr>
+          <w:rStyle w:val="VerbatimChar"/>
+        </w:rPr>
+        <w:t xml:space="preserve">Total fees:                      R$ 41,8 mi (4,2% do volume)</w:t>
+      </w:r>
+    </w:p>
+    <w:bookmarkEnd w:id="29"/>
+    <w:bookmarkStart w:id="30" w:name="c-retenção"/>
+    <w:p>
+      <w:pPr>
+        <w:pStyle w:val="Heading4"/>
+      </w:pPr>
+      <w:r>
+        <w:t xml:space="preserve">C) Retenção</w:t>
+      </w:r>
+    </w:p>
+    <w:p>
+      <w:pPr>
+        <w:pStyle w:val="FirstParagraph"/>
+      </w:pPr>
+      <w:r>
+        <w:rPr>
+          <w:bCs/>
+          <w:b/>
+        </w:rPr>
+        <w:t xml:space="preserve">Estratégias:</w:t>
+      </w:r>
+      <w:r>
+        <w:t xml:space="preserve"> </w:t>
+      </w:r>
+      <w:r>
+        <w:t xml:space="preserve">1.</w:t>
+      </w:r>
+      <w:r>
+        <w:t xml:space="preserve"> </w:t>
+      </w:r>
+      <w:r>
+        <w:rPr>
+          <w:bCs/>
+          <w:b/>
+        </w:rPr>
+        <w:t xml:space="preserve">Programa de relacionamento</w:t>
+      </w:r>
+      <w:r>
+        <w:t xml:space="preserve">: Cashback de 0,5% em saldo devedor para clientes adimplentes por 12 meses</w:t>
+      </w:r>
+      <w:r>
+        <w:t xml:space="preserve"> </w:t>
+      </w:r>
+      <w:r>
+        <w:t xml:space="preserve">2.</w:t>
+      </w:r>
+      <w:r>
+        <w:t xml:space="preserve"> </w:t>
+      </w:r>
+      <w:r>
+        <w:rPr>
+          <w:bCs/>
+          <w:b/>
+        </w:rPr>
+        <w:t xml:space="preserve">Portabilidade defensiva</w:t>
+      </w:r>
+      <w:r>
+        <w:t xml:space="preserve">: Match automático de ofertas até -2 p.p. da taxa</w:t>
+      </w:r>
+      <w:r>
+        <w:t xml:space="preserve"> </w:t>
+      </w:r>
+      <w:r>
+        <w:t xml:space="preserve">3.</w:t>
+      </w:r>
+      <w:r>
+        <w:t xml:space="preserve"> </w:t>
+      </w:r>
+      <w:r>
+        <w:rPr>
+          <w:bCs/>
+          <w:b/>
+        </w:rPr>
+        <w:t xml:space="preserve">Cross-sell digital</w:t>
+      </w:r>
+      <w:r>
+        <w:t xml:space="preserve">: App com antecipação de parcelas e refinanciamento self-service</w:t>
+      </w:r>
+      <w:r>
+        <w:t xml:space="preserve"> </w:t>
+      </w:r>
+      <w:r>
+        <w:t xml:space="preserve">4.</w:t>
+      </w:r>
+      <w:r>
+        <w:t xml:space="preserve"> </w:t>
+      </w:r>
+      <w:r>
+        <w:rPr>
+          <w:bCs/>
+          <w:b/>
+        </w:rPr>
+        <w:t xml:space="preserve">Renovação automática</w:t>
+      </w:r>
+      <w:r>
+        <w:t xml:space="preserve">: Após 70% de amortização, oferta automática de novo crédito</w:t>
+      </w:r>
+    </w:p>
+    <w:p>
+      <w:pPr>
+        <w:pStyle w:val="BodyText"/>
+      </w:pPr>
+      <w:r>
+        <w:rPr>
+          <w:bCs/>
+          <w:b/>
+        </w:rPr>
+        <w:t xml:space="preserve">Meta de retenção</w:t>
+      </w:r>
+      <w:r>
+        <w:t xml:space="preserve">: 85% ao ano (vs benchmark de 78%)</w:t>
+      </w:r>
+    </w:p>
+    <w:bookmarkEnd w:id="30"/>
+    <w:bookmarkEnd w:id="31"/>
+    <w:bookmarkStart w:id="32" w:name="kpis-executivos"/>
     <w:p>
       <w:pPr>
         <w:pStyle w:val="Heading3"/>
@@ -1153,388 +1688,388 @@
         </w:pict>
       </w:r>
     </w:p>
-    <w:bookmarkEnd w:id="27"/>
-    <w:bookmarkEnd w:id="28"/>
-    <w:bookmarkStart w:id="39" w:name="parte-2-crédito-e-precificação"/>
-    <w:p>
-      <w:pPr>
-        <w:pStyle w:val="Heading2"/>
-      </w:pPr>
-      <w:r>
-        <w:t xml:space="preserve">PARTE 2 – CRÉDITO E PRECIFICAÇÃO</w:t>
-      </w:r>
-    </w:p>
-    <w:bookmarkStart w:id="31" w:name="cálculo-de-perda-esperada-el"/>
-    <w:p>
-      <w:pPr>
-        <w:pStyle w:val="Heading3"/>
-      </w:pPr>
-      <w:r>
-        <w:t xml:space="preserve">2.1 Cálculo de Perda Esperada (EL)</w:t>
-      </w:r>
-    </w:p>
-    <w:p>
-      <w:pPr>
-        <w:pStyle w:val="FirstParagraph"/>
-      </w:pPr>
-      <w:r>
-        <w:rPr>
-          <w:bCs/>
-          <w:b/>
-        </w:rPr>
-        <w:t xml:space="preserve">Fórmula</w:t>
-      </w:r>
-      <w:r>
-        <w:t xml:space="preserve">: EL = PD × LGD × EAD</w:t>
-      </w:r>
-    </w:p>
-    <w:bookmarkStart w:id="29" w:name="crédito-pessoal"/>
-    <w:p>
-      <w:pPr>
-        <w:pStyle w:val="Heading4"/>
-      </w:pPr>
-      <w:r>
-        <w:t xml:space="preserve">Crédito Pessoal</w:t>
-      </w:r>
-    </w:p>
-    <w:p>
-      <w:pPr>
-        <w:pStyle w:val="SourceCode"/>
-      </w:pPr>
-      <w:r>
-        <w:rPr>
-          <w:rStyle w:val="VerbatimChar"/>
-        </w:rPr>
-        <w:t xml:space="preserve">PD:  9,0%</w:t>
-      </w:r>
-      <w:r>
-        <w:br/>
-      </w:r>
-      <w:r>
-        <w:rPr>
-          <w:rStyle w:val="VerbatimChar"/>
-        </w:rPr>
-        <w:t xml:space="preserve">LGD: 60%</w:t>
-      </w:r>
-      <w:r>
-        <w:br/>
-      </w:r>
-      <w:r>
-        <w:rPr>
-          <w:rStyle w:val="VerbatimChar"/>
-        </w:rPr>
-        <w:t xml:space="preserve">EAD: 100% (fully drawn)</w:t>
-      </w:r>
-      <w:r>
-        <w:br/>
-      </w:r>
-      <w:r>
-        <w:br/>
-      </w:r>
-      <w:r>
-        <w:rPr>
-          <w:rStyle w:val="VerbatimChar"/>
-        </w:rPr>
-        <w:t xml:space="preserve">EL = 9,0% × 60% × 100% = 5,4% a.a.</w:t>
-      </w:r>
-    </w:p>
-    <w:bookmarkEnd w:id="29"/>
-    <w:bookmarkStart w:id="30" w:name="consignado"/>
-    <w:p>
-      <w:pPr>
-        <w:pStyle w:val="Heading4"/>
-      </w:pPr>
-      <w:r>
-        <w:t xml:space="preserve">Consignado</w:t>
-      </w:r>
-    </w:p>
-    <w:p>
-      <w:pPr>
-        <w:pStyle w:val="SourceCode"/>
-      </w:pPr>
-      <w:r>
-        <w:rPr>
-          <w:rStyle w:val="VerbatimChar"/>
-        </w:rPr>
-        <w:t xml:space="preserve">PD:  2,8%</w:t>
-      </w:r>
-      <w:r>
-        <w:br/>
-      </w:r>
-      <w:r>
-        <w:rPr>
-          <w:rStyle w:val="VerbatimChar"/>
-        </w:rPr>
-        <w:t xml:space="preserve">LGD: 60%</w:t>
-      </w:r>
-      <w:r>
-        <w:br/>
-      </w:r>
-      <w:r>
-        <w:rPr>
-          <w:rStyle w:val="VerbatimChar"/>
-        </w:rPr>
-        <w:t xml:space="preserve">EAD: 100%</w:t>
-      </w:r>
-      <w:r>
-        <w:br/>
-      </w:r>
-      <w:r>
-        <w:br/>
-      </w:r>
-      <w:r>
-        <w:rPr>
-          <w:rStyle w:val="VerbatimChar"/>
-        </w:rPr>
-        <w:t xml:space="preserve">EL = 2,8% × 60% × 100% = 1,68% a.a.</w:t>
-      </w:r>
-    </w:p>
-    <w:p>
-      <w:pPr>
-        <w:pStyle w:val="FirstParagraph"/>
-      </w:pPr>
-      <w:r>
-        <w:rPr>
-          <w:bCs/>
-          <w:b/>
-        </w:rPr>
-        <w:t xml:space="preserve">Provisões necessárias (IFRS 9):</w:t>
-      </w:r>
-      <w:r>
-        <w:t xml:space="preserve"> </w:t>
-      </w:r>
-      <w:r>
-        <w:t xml:space="preserve">- Pessoal: ~6,2% (EL + buffer contracíclico 15%)</w:t>
-      </w:r>
-      <w:r>
-        <w:t xml:space="preserve"> </w:t>
-      </w:r>
-      <w:r>
-        <w:t xml:space="preserve">- Consignado: ~2,0% (EL + buffer contracíclico 20%)</w:t>
-      </w:r>
-    </w:p>
-    <w:bookmarkEnd w:id="30"/>
-    <w:bookmarkEnd w:id="31"/>
-    <w:bookmarkStart w:id="33" w:name="taxa-mínima-sustentável"/>
-    <w:p>
-      <w:pPr>
-        <w:pStyle w:val="Heading3"/>
-      </w:pPr>
-      <w:r>
-        <w:t xml:space="preserve">2.2 Taxa Mínima Sustentável</w:t>
-      </w:r>
-    </w:p>
-    <w:bookmarkStart w:id="32" w:name="modelo-de-precificação-simplificado"/>
-    <w:p>
-      <w:pPr>
-        <w:pStyle w:val="Heading4"/>
-      </w:pPr>
-      <w:r>
-        <w:t xml:space="preserve">Modelo de Precificação Simplificado</w:t>
-      </w:r>
-    </w:p>
-    <w:p>
-      <w:pPr>
-        <w:pStyle w:val="FirstParagraph"/>
-      </w:pPr>
-      <w:r>
-        <w:rPr>
-          <w:bCs/>
-          <w:b/>
-        </w:rPr>
-        <w:t xml:space="preserve">Consignado:</w:t>
-      </w:r>
-    </w:p>
-    <w:p>
-      <w:pPr>
-        <w:pStyle w:val="SourceCode"/>
-      </w:pPr>
-      <w:r>
-        <w:rPr>
-          <w:rStyle w:val="VerbatimChar"/>
-        </w:rPr>
-        <w:t xml:space="preserve">Componentes:</w:t>
-      </w:r>
-      <w:r>
-        <w:br/>
-      </w:r>
-      <w:r>
-        <w:rPr>
-          <w:rStyle w:val="VerbatimChar"/>
-        </w:rPr>
-        <w:t xml:space="preserve">1. Custo de funding:           13,5% (CDI + 0,9%)</w:t>
-      </w:r>
-      <w:r>
-        <w:br/>
-      </w:r>
-      <w:r>
-        <w:rPr>
-          <w:rStyle w:val="VerbatimChar"/>
-        </w:rPr>
-        <w:t xml:space="preserve">2. Custo de capital (8% × 15%): 1,2%</w:t>
-      </w:r>
-      <w:r>
-        <w:br/>
-      </w:r>
-      <w:r>
-        <w:rPr>
-          <w:rStyle w:val="VerbatimChar"/>
-        </w:rPr>
-        <w:t xml:space="preserve">3. Perda esperada:              1,7%</w:t>
-      </w:r>
-      <w:r>
-        <w:br/>
-      </w:r>
-      <w:r>
-        <w:rPr>
-          <w:rStyle w:val="VerbatimChar"/>
-        </w:rPr>
-        <w:t xml:space="preserve">4. Custo operacional:           1,8%</w:t>
-      </w:r>
-      <w:r>
-        <w:br/>
-      </w:r>
-      <w:r>
-        <w:rPr>
-          <w:rStyle w:val="VerbatimChar"/>
-        </w:rPr>
-        <w:t xml:space="preserve">5. Margem mínima (ROE 15%):     2,5%</w:t>
-      </w:r>
-      <w:r>
-        <w:br/>
-      </w:r>
-      <w:r>
-        <w:rPr>
-          <w:rStyle w:val="VerbatimChar"/>
-        </w:rPr>
-        <w:t xml:space="preserve">─────────────────────────────────────</w:t>
-      </w:r>
-      <w:r>
-        <w:br/>
-      </w:r>
-      <w:r>
-        <w:rPr>
-          <w:rStyle w:val="VerbatimChar"/>
-        </w:rPr>
-        <w:t xml:space="preserve">Taxa mínima:                   20,7% a.a.</w:t>
-      </w:r>
-      <w:r>
-        <w:br/>
-      </w:r>
-      <w:r>
-        <w:rPr>
-          <w:rStyle w:val="VerbatimChar"/>
-        </w:rPr>
-        <w:t xml:space="preserve">Taxa proposta:                 21,5% a.a. ✓</w:t>
-      </w:r>
-    </w:p>
-    <w:p>
-      <w:pPr>
-        <w:pStyle w:val="FirstParagraph"/>
-      </w:pPr>
-      <w:r>
-        <w:rPr>
-          <w:bCs/>
-          <w:b/>
-        </w:rPr>
-        <w:t xml:space="preserve">Crédito Pessoal:</w:t>
-      </w:r>
-    </w:p>
-    <w:p>
-      <w:pPr>
-        <w:pStyle w:val="SourceCode"/>
-      </w:pPr>
-      <w:r>
-        <w:rPr>
-          <w:rStyle w:val="VerbatimChar"/>
-        </w:rPr>
-        <w:t xml:space="preserve">Componentes:</w:t>
-      </w:r>
-      <w:r>
-        <w:br/>
-      </w:r>
-      <w:r>
-        <w:rPr>
-          <w:rStyle w:val="VerbatimChar"/>
-        </w:rPr>
-        <w:t xml:space="preserve">1. Custo de funding:           13,5%</w:t>
-      </w:r>
-      <w:r>
-        <w:br/>
-      </w:r>
-      <w:r>
-        <w:rPr>
-          <w:rStyle w:val="VerbatimChar"/>
-        </w:rPr>
-        <w:t xml:space="preserve">2. Custo de capital (8% × 22%): 1,8%</w:t>
-      </w:r>
-      <w:r>
-        <w:br/>
-      </w:r>
-      <w:r>
-        <w:rPr>
-          <w:rStyle w:val="VerbatimChar"/>
-        </w:rPr>
-        <w:t xml:space="preserve">3. Perda esperada:              5,4%</w:t>
-      </w:r>
-      <w:r>
-        <w:br/>
-      </w:r>
-      <w:r>
-        <w:rPr>
-          <w:rStyle w:val="VerbatimChar"/>
-        </w:rPr>
-        <w:t xml:space="preserve">4. Custo operacional:           3,2%</w:t>
-      </w:r>
-      <w:r>
-        <w:br/>
-      </w:r>
-      <w:r>
-        <w:rPr>
-          <w:rStyle w:val="VerbatimChar"/>
-        </w:rPr>
-        <w:t xml:space="preserve">5. Margem mínima (ROE 15%):     4,1%</w:t>
-      </w:r>
-      <w:r>
-        <w:br/>
-      </w:r>
-      <w:r>
-        <w:rPr>
-          <w:rStyle w:val="VerbatimChar"/>
-        </w:rPr>
-        <w:t xml:space="preserve">─────────────────────────────────────</w:t>
-      </w:r>
-      <w:r>
-        <w:br/>
-      </w:r>
-      <w:r>
-        <w:rPr>
-          <w:rStyle w:val="VerbatimChar"/>
-        </w:rPr>
-        <w:t xml:space="preserve">Taxa mínima:                   28,0% a.a.</w:t>
-      </w:r>
-      <w:r>
-        <w:br/>
-      </w:r>
-      <w:r>
-        <w:rPr>
-          <w:rStyle w:val="VerbatimChar"/>
-        </w:rPr>
-        <w:t xml:space="preserve">Taxa proposta:                 29,5% a.a. ✓</w:t>
-      </w:r>
-    </w:p>
     <w:bookmarkEnd w:id="32"/>
     <w:bookmarkEnd w:id="33"/>
-    <w:bookmarkStart w:id="37" w:name="ajustes-de-política-de-crédito"/>
+    <w:bookmarkStart w:id="44" w:name="parte-2-crédito-e-precificação"/>
+    <w:p>
+      <w:pPr>
+        <w:pStyle w:val="Heading2"/>
+      </w:pPr>
+      <w:r>
+        <w:t xml:space="preserve">PARTE 2 – CRÉDITO E PRECIFICAÇÃO</w:t>
+      </w:r>
+    </w:p>
+    <w:bookmarkStart w:id="36" w:name="cálculo-de-perda-esperada-el"/>
     <w:p>
       <w:pPr>
         <w:pStyle w:val="Heading3"/>
       </w:pPr>
       <w:r>
+        <w:t xml:space="preserve">2.1 Cálculo de Perda Esperada (EL)</w:t>
+      </w:r>
+    </w:p>
+    <w:p>
+      <w:pPr>
+        <w:pStyle w:val="FirstParagraph"/>
+      </w:pPr>
+      <w:r>
+        <w:rPr>
+          <w:bCs/>
+          <w:b/>
+        </w:rPr>
+        <w:t xml:space="preserve">Fórmula</w:t>
+      </w:r>
+      <w:r>
+        <w:t xml:space="preserve">: EL = PD × LGD × EAD</w:t>
+      </w:r>
+    </w:p>
+    <w:bookmarkStart w:id="34" w:name="crédito-pessoal"/>
+    <w:p>
+      <w:pPr>
+        <w:pStyle w:val="Heading4"/>
+      </w:pPr>
+      <w:r>
+        <w:t xml:space="preserve">Crédito Pessoal</w:t>
+      </w:r>
+    </w:p>
+    <w:p>
+      <w:pPr>
+        <w:pStyle w:val="SourceCode"/>
+      </w:pPr>
+      <w:r>
+        <w:rPr>
+          <w:rStyle w:val="VerbatimChar"/>
+        </w:rPr>
+        <w:t xml:space="preserve">PD:  9,0%</w:t>
+      </w:r>
+      <w:r>
+        <w:br/>
+      </w:r>
+      <w:r>
+        <w:rPr>
+          <w:rStyle w:val="VerbatimChar"/>
+        </w:rPr>
+        <w:t xml:space="preserve">LGD: 60%</w:t>
+      </w:r>
+      <w:r>
+        <w:br/>
+      </w:r>
+      <w:r>
+        <w:rPr>
+          <w:rStyle w:val="VerbatimChar"/>
+        </w:rPr>
+        <w:t xml:space="preserve">EAD: 100% (fully drawn)</w:t>
+      </w:r>
+      <w:r>
+        <w:br/>
+      </w:r>
+      <w:r>
+        <w:br/>
+      </w:r>
+      <w:r>
+        <w:rPr>
+          <w:rStyle w:val="VerbatimChar"/>
+        </w:rPr>
+        <w:t xml:space="preserve">EL = 9,0% × 60% × 100% = 5,4% a.a.</w:t>
+      </w:r>
+    </w:p>
+    <w:bookmarkEnd w:id="34"/>
+    <w:bookmarkStart w:id="35" w:name="consignado"/>
+    <w:p>
+      <w:pPr>
+        <w:pStyle w:val="Heading4"/>
+      </w:pPr>
+      <w:r>
+        <w:t xml:space="preserve">Consignado</w:t>
+      </w:r>
+    </w:p>
+    <w:p>
+      <w:pPr>
+        <w:pStyle w:val="SourceCode"/>
+      </w:pPr>
+      <w:r>
+        <w:rPr>
+          <w:rStyle w:val="VerbatimChar"/>
+        </w:rPr>
+        <w:t xml:space="preserve">PD:  2,8%</w:t>
+      </w:r>
+      <w:r>
+        <w:br/>
+      </w:r>
+      <w:r>
+        <w:rPr>
+          <w:rStyle w:val="VerbatimChar"/>
+        </w:rPr>
+        <w:t xml:space="preserve">LGD: 60%</w:t>
+      </w:r>
+      <w:r>
+        <w:br/>
+      </w:r>
+      <w:r>
+        <w:rPr>
+          <w:rStyle w:val="VerbatimChar"/>
+        </w:rPr>
+        <w:t xml:space="preserve">EAD: 100%</w:t>
+      </w:r>
+      <w:r>
+        <w:br/>
+      </w:r>
+      <w:r>
+        <w:br/>
+      </w:r>
+      <w:r>
+        <w:rPr>
+          <w:rStyle w:val="VerbatimChar"/>
+        </w:rPr>
+        <w:t xml:space="preserve">EL = 2,8% × 60% × 100% = 1,68% a.a.</w:t>
+      </w:r>
+    </w:p>
+    <w:p>
+      <w:pPr>
+        <w:pStyle w:val="FirstParagraph"/>
+      </w:pPr>
+      <w:r>
+        <w:rPr>
+          <w:bCs/>
+          <w:b/>
+        </w:rPr>
+        <w:t xml:space="preserve">Provisões necessárias (IFRS 9):</w:t>
+      </w:r>
+      <w:r>
+        <w:t xml:space="preserve"> </w:t>
+      </w:r>
+      <w:r>
+        <w:t xml:space="preserve">- Pessoal: ~6,2% (EL + buffer contracíclico 15%)</w:t>
+      </w:r>
+      <w:r>
+        <w:t xml:space="preserve"> </w:t>
+      </w:r>
+      <w:r>
+        <w:t xml:space="preserve">- Consignado: ~2,0% (EL + buffer contracíclico 20%)</w:t>
+      </w:r>
+    </w:p>
+    <w:bookmarkEnd w:id="35"/>
+    <w:bookmarkEnd w:id="36"/>
+    <w:bookmarkStart w:id="38" w:name="taxa-mínima-sustentável"/>
+    <w:p>
+      <w:pPr>
+        <w:pStyle w:val="Heading3"/>
+      </w:pPr>
+      <w:r>
+        <w:t xml:space="preserve">2.2 Taxa Mínima Sustentável</w:t>
+      </w:r>
+    </w:p>
+    <w:bookmarkStart w:id="37" w:name="modelo-de-precificação-simplificado"/>
+    <w:p>
+      <w:pPr>
+        <w:pStyle w:val="Heading4"/>
+      </w:pPr>
+      <w:r>
+        <w:t xml:space="preserve">Modelo de Precificação Simplificado</w:t>
+      </w:r>
+    </w:p>
+    <w:p>
+      <w:pPr>
+        <w:pStyle w:val="FirstParagraph"/>
+      </w:pPr>
+      <w:r>
+        <w:rPr>
+          <w:bCs/>
+          <w:b/>
+        </w:rPr>
+        <w:t xml:space="preserve">Consignado:</w:t>
+      </w:r>
+    </w:p>
+    <w:p>
+      <w:pPr>
+        <w:pStyle w:val="SourceCode"/>
+      </w:pPr>
+      <w:r>
+        <w:rPr>
+          <w:rStyle w:val="VerbatimChar"/>
+        </w:rPr>
+        <w:t xml:space="preserve">Componentes:</w:t>
+      </w:r>
+      <w:r>
+        <w:br/>
+      </w:r>
+      <w:r>
+        <w:rPr>
+          <w:rStyle w:val="VerbatimChar"/>
+        </w:rPr>
+        <w:t xml:space="preserve">1. Custo de funding:           13,5% (CDI + 0,9%)</w:t>
+      </w:r>
+      <w:r>
+        <w:br/>
+      </w:r>
+      <w:r>
+        <w:rPr>
+          <w:rStyle w:val="VerbatimChar"/>
+        </w:rPr>
+        <w:t xml:space="preserve">2. Custo de capital (8% × 15%): 1,2%</w:t>
+      </w:r>
+      <w:r>
+        <w:br/>
+      </w:r>
+      <w:r>
+        <w:rPr>
+          <w:rStyle w:val="VerbatimChar"/>
+        </w:rPr>
+        <w:t xml:space="preserve">3. Perda esperada:              1,7%</w:t>
+      </w:r>
+      <w:r>
+        <w:br/>
+      </w:r>
+      <w:r>
+        <w:rPr>
+          <w:rStyle w:val="VerbatimChar"/>
+        </w:rPr>
+        <w:t xml:space="preserve">4. Custo operacional:           1,8%</w:t>
+      </w:r>
+      <w:r>
+        <w:br/>
+      </w:r>
+      <w:r>
+        <w:rPr>
+          <w:rStyle w:val="VerbatimChar"/>
+        </w:rPr>
+        <w:t xml:space="preserve">5. Margem mínima (ROE 15%):     2,5%</w:t>
+      </w:r>
+      <w:r>
+        <w:br/>
+      </w:r>
+      <w:r>
+        <w:rPr>
+          <w:rStyle w:val="VerbatimChar"/>
+        </w:rPr>
+        <w:t xml:space="preserve">─────────────────────────────────────</w:t>
+      </w:r>
+      <w:r>
+        <w:br/>
+      </w:r>
+      <w:r>
+        <w:rPr>
+          <w:rStyle w:val="VerbatimChar"/>
+        </w:rPr>
+        <w:t xml:space="preserve">Taxa mínima:                   20,7% a.a.</w:t>
+      </w:r>
+      <w:r>
+        <w:br/>
+      </w:r>
+      <w:r>
+        <w:rPr>
+          <w:rStyle w:val="VerbatimChar"/>
+        </w:rPr>
+        <w:t xml:space="preserve">Taxa proposta:                 21,5% a.a. ✓</w:t>
+      </w:r>
+    </w:p>
+    <w:p>
+      <w:pPr>
+        <w:pStyle w:val="FirstParagraph"/>
+      </w:pPr>
+      <w:r>
+        <w:rPr>
+          <w:bCs/>
+          <w:b/>
+        </w:rPr>
+        <w:t xml:space="preserve">Crédito Pessoal:</w:t>
+      </w:r>
+    </w:p>
+    <w:p>
+      <w:pPr>
+        <w:pStyle w:val="SourceCode"/>
+      </w:pPr>
+      <w:r>
+        <w:rPr>
+          <w:rStyle w:val="VerbatimChar"/>
+        </w:rPr>
+        <w:t xml:space="preserve">Componentes:</w:t>
+      </w:r>
+      <w:r>
+        <w:br/>
+      </w:r>
+      <w:r>
+        <w:rPr>
+          <w:rStyle w:val="VerbatimChar"/>
+        </w:rPr>
+        <w:t xml:space="preserve">1. Custo de funding:           13,5%</w:t>
+      </w:r>
+      <w:r>
+        <w:br/>
+      </w:r>
+      <w:r>
+        <w:rPr>
+          <w:rStyle w:val="VerbatimChar"/>
+        </w:rPr>
+        <w:t xml:space="preserve">2. Custo de capital (8% × 22%): 1,8%</w:t>
+      </w:r>
+      <w:r>
+        <w:br/>
+      </w:r>
+      <w:r>
+        <w:rPr>
+          <w:rStyle w:val="VerbatimChar"/>
+        </w:rPr>
+        <w:t xml:space="preserve">3. Perda esperada:              5,4%</w:t>
+      </w:r>
+      <w:r>
+        <w:br/>
+      </w:r>
+      <w:r>
+        <w:rPr>
+          <w:rStyle w:val="VerbatimChar"/>
+        </w:rPr>
+        <w:t xml:space="preserve">4. Custo operacional:           3,2%</w:t>
+      </w:r>
+      <w:r>
+        <w:br/>
+      </w:r>
+      <w:r>
+        <w:rPr>
+          <w:rStyle w:val="VerbatimChar"/>
+        </w:rPr>
+        <w:t xml:space="preserve">5. Margem mínima (ROE 15%):     4,1%</w:t>
+      </w:r>
+      <w:r>
+        <w:br/>
+      </w:r>
+      <w:r>
+        <w:rPr>
+          <w:rStyle w:val="VerbatimChar"/>
+        </w:rPr>
+        <w:t xml:space="preserve">─────────────────────────────────────</w:t>
+      </w:r>
+      <w:r>
+        <w:br/>
+      </w:r>
+      <w:r>
+        <w:rPr>
+          <w:rStyle w:val="VerbatimChar"/>
+        </w:rPr>
+        <w:t xml:space="preserve">Taxa mínima:                   28,0% a.a.</w:t>
+      </w:r>
+      <w:r>
+        <w:br/>
+      </w:r>
+      <w:r>
+        <w:rPr>
+          <w:rStyle w:val="VerbatimChar"/>
+        </w:rPr>
+        <w:t xml:space="preserve">Taxa proposta:                 29,5% a.a. ✓</w:t>
+      </w:r>
+    </w:p>
+    <w:bookmarkEnd w:id="37"/>
+    <w:bookmarkEnd w:id="38"/>
+    <w:bookmarkStart w:id="42" w:name="ajustes-de-política-de-crédito"/>
+    <w:p>
+      <w:pPr>
+        <w:pStyle w:val="Heading3"/>
+      </w:pPr>
+      <w:r>
         <w:t xml:space="preserve">2.3 Ajustes de Política de Crédito</w:t>
       </w:r>
     </w:p>
-    <w:bookmarkStart w:id="34" w:name="ajuste-1-segmentação-avançada-por-score"/>
+    <w:bookmarkStart w:id="39" w:name="ajuste-1-segmentação-avançada-por-score"/>
     <w:p>
       <w:pPr>
         <w:pStyle w:val="Heading4"/>
@@ -1972,8 +2507,8 @@
         <w:t xml:space="preserve">: ↓ 0,8 p.p. na PD, ↑ 12% em volume aprovado</w:t>
       </w:r>
     </w:p>
-    <w:bookmarkEnd w:id="34"/>
-    <w:bookmarkStart w:id="35" w:name="Xf79ad8a5526112498feb11a88b3f682b62695a2"/>
+    <w:bookmarkEnd w:id="39"/>
+    <w:bookmarkStart w:id="40" w:name="Xf79ad8a5526112498feb11a88b3f682b62695a2"/>
     <w:p>
       <w:pPr>
         <w:pStyle w:val="Heading4"/>
@@ -2027,8 +2562,8 @@
         <w:t xml:space="preserve">: ↑ 18% em volume (clientes sub-bancarizados)</w:t>
       </w:r>
     </w:p>
-    <w:bookmarkEnd w:id="35"/>
-    <w:bookmarkStart w:id="36" w:name="ajuste-3-bureau-de-dados-alternativos"/>
+    <w:bookmarkEnd w:id="40"/>
+    <w:bookmarkStart w:id="41" w:name="ajuste-3-bureau-de-dados-alternativos"/>
     <w:p>
       <w:pPr>
         <w:pStyle w:val="Heading4"/>
@@ -2082,9 +2617,9 @@
         <w:t xml:space="preserve">: ↑ 8% aprovação em faixa C/D, ↓ 1,2 p.p. na PD desta faixa</w:t>
       </w:r>
     </w:p>
-    <w:bookmarkEnd w:id="36"/>
-    <w:bookmarkEnd w:id="37"/>
-    <w:bookmarkStart w:id="38" w:name="trade-offs-crescimento-vs-risco"/>
+    <w:bookmarkEnd w:id="41"/>
+    <w:bookmarkEnd w:id="42"/>
+    <w:bookmarkStart w:id="43" w:name="trade-offs-crescimento-vs-risco"/>
     <w:p>
       <w:pPr>
         <w:pStyle w:val="Heading3"/>
@@ -2468,9 +3003,9 @@
         </w:pict>
       </w:r>
     </w:p>
-    <w:bookmarkEnd w:id="38"/>
-    <w:bookmarkEnd w:id="39"/>
-    <w:bookmarkStart w:id="47" w:name="parte-3-monetização-e-conduta"/>
+    <w:bookmarkEnd w:id="43"/>
+    <w:bookmarkEnd w:id="44"/>
+    <w:bookmarkStart w:id="52" w:name="parte-3-monetização-e-conduta"/>
     <w:p>
       <w:pPr>
         <w:pStyle w:val="Heading2"/>
@@ -2479,7 +3014,7 @@
         <w:t xml:space="preserve">PARTE 3 – MONETIZAÇÃO E CONDUTA</w:t>
       </w:r>
     </w:p>
-    <w:bookmarkStart w:id="41" w:name="proposta-de-monetização"/>
+    <w:bookmarkStart w:id="46" w:name="proposta-de-monetização"/>
     <w:p>
       <w:pPr>
         <w:pStyle w:val="Heading3"/>
@@ -2488,7 +3023,7 @@
         <w:t xml:space="preserve">3.1 Proposta de Monetização</w:t>
       </w:r>
     </w:p>
-    <w:bookmarkStart w:id="40" w:name="X56e03d6ae935256ebd0cde93c5702bffba0f423"/>
+    <w:bookmarkStart w:id="45" w:name="X56e03d6ae935256ebd0cde93c5702bffba0f423"/>
     <w:p>
       <w:pPr>
         <w:pStyle w:val="Heading4"/>
@@ -2711,9 +3246,9 @@
         <w:t xml:space="preserve">Margem líquida banco:        R$ 16,6 mi/ano (0,5% da carteira)</w:t>
       </w:r>
     </w:p>
-    <w:bookmarkEnd w:id="40"/>
-    <w:bookmarkEnd w:id="41"/>
-    <w:bookmarkStart w:id="43" w:name="controles-para-evitar-venda-casada"/>
+    <w:bookmarkEnd w:id="45"/>
+    <w:bookmarkEnd w:id="46"/>
+    <w:bookmarkStart w:id="48" w:name="controles-para-evitar-venda-casada"/>
     <w:p>
       <w:pPr>
         <w:pStyle w:val="Heading3"/>
@@ -2722,7 +3257,7 @@
         <w:t xml:space="preserve">3.2 Controles para Evitar Venda Casada</w:t>
       </w:r>
     </w:p>
-    <w:bookmarkStart w:id="42" w:name="controles-operacionais"/>
+    <w:bookmarkStart w:id="47" w:name="controles-operacionais"/>
     <w:p>
       <w:pPr>
         <w:pStyle w:val="Heading4"/>
@@ -2981,9 +3516,9 @@
         <w:t xml:space="preserve">Reporte trimestral ao Comitê Executivo e COAF</w:t>
       </w:r>
     </w:p>
-    <w:bookmarkEnd w:id="42"/>
-    <w:bookmarkEnd w:id="43"/>
-    <w:bookmarkStart w:id="44" w:name="kpis-e-kris-com-thresholds"/>
+    <w:bookmarkEnd w:id="47"/>
+    <w:bookmarkEnd w:id="48"/>
+    <w:bookmarkStart w:id="49" w:name="kpis-e-kris-com-thresholds"/>
     <w:p>
       <w:pPr>
         <w:pStyle w:val="Heading3"/>
@@ -3661,8 +4196,8 @@
         <w:t xml:space="preserve">- Vermelho: Escalação ao CCO + suspensão preventiva + plano de ação em 48h</w:t>
       </w:r>
     </w:p>
-    <w:bookmarkEnd w:id="44"/>
-    <w:bookmarkStart w:id="46" w:name="impacto-econômico-do-ruído"/>
+    <w:bookmarkEnd w:id="49"/>
+    <w:bookmarkStart w:id="51" w:name="impacto-econômico-do-ruído"/>
     <w:p>
       <w:pPr>
         <w:pStyle w:val="Heading3"/>
@@ -3698,7 +4233,7 @@
         <w:t xml:space="preserve">: Reclamações, processos, multas e danos reputacionais decorrentes de má conduta.</w:t>
       </w:r>
     </w:p>
-    <w:bookmarkStart w:id="45" w:name="análise-de-custo-benefício"/>
+    <w:bookmarkStart w:id="50" w:name="análise-de-custo-benefício"/>
     <w:p>
       <w:pPr>
         <w:pStyle w:val="Heading4"/>
@@ -3958,10 +4493,10 @@
         </w:pict>
       </w:r>
     </w:p>
-    <w:bookmarkEnd w:id="45"/>
-    <w:bookmarkEnd w:id="46"/>
-    <w:bookmarkEnd w:id="47"/>
-    <w:bookmarkStart w:id="59" w:name="parte-4-funding-e-captação"/>
+    <w:bookmarkEnd w:id="50"/>
+    <w:bookmarkEnd w:id="51"/>
+    <w:bookmarkEnd w:id="52"/>
+    <w:bookmarkStart w:id="64" w:name="parte-4-funding-e-captação"/>
     <w:p>
       <w:pPr>
         <w:pStyle w:val="Heading2"/>
@@ -3970,7 +4505,7 @@
         <w:t xml:space="preserve">PARTE 4 – FUNDING E CAPTAÇÃO</w:t>
       </w:r>
     </w:p>
-    <w:bookmarkStart w:id="50" w:name="estratégia-de-funding-para-r-1-bi"/>
+    <w:bookmarkStart w:id="55" w:name="estratégia-de-funding-para-r-1-bi"/>
     <w:p>
       <w:pPr>
         <w:pStyle w:val="Heading3"/>
@@ -3979,7 +4514,7 @@
         <w:t xml:space="preserve">4.1 Estratégia de Funding para R$ 1 bi</w:t>
       </w:r>
     </w:p>
-    <w:bookmarkStart w:id="48" w:name="análise-de-alternativas"/>
+    <w:bookmarkStart w:id="53" w:name="análise-de-alternativas"/>
     <w:p>
       <w:pPr>
         <w:pStyle w:val="Heading4"/>
@@ -4454,8 +4989,8 @@
         </w:tc>
       </w:tr>
     </w:tbl>
-    <w:bookmarkEnd w:id="48"/>
-    <w:bookmarkStart w:id="49" w:name="estratégia-escolhida-mix-cdb-dpge2"/>
+    <w:bookmarkEnd w:id="53"/>
+    <w:bookmarkStart w:id="54" w:name="estratégia-escolhida-mix-cdb-dpge2"/>
     <w:p>
       <w:pPr>
         <w:pStyle w:val="Heading4"/>
@@ -4722,9 +5257,9 @@
         <w:t xml:space="preserve">Gap: 3 meses (aceitável, dentro de tolerância)</w:t>
       </w:r>
     </w:p>
-    <w:bookmarkEnd w:id="49"/>
-    <w:bookmarkEnd w:id="50"/>
-    <w:bookmarkStart w:id="51" w:name="risco-dominante"/>
+    <w:bookmarkEnd w:id="54"/>
+    <w:bookmarkEnd w:id="55"/>
+    <w:bookmarkStart w:id="56" w:name="risco-dominante"/>
     <w:p>
       <w:pPr>
         <w:pStyle w:val="Heading3"/>
@@ -4849,8 +5384,8 @@
         <w:t xml:space="preserve">- Margem de segurança:         R$ 25 mi ✓</w:t>
       </w:r>
     </w:p>
-    <w:bookmarkEnd w:id="51"/>
-    <w:bookmarkStart w:id="55" w:name="controles-mínimos"/>
+    <w:bookmarkEnd w:id="56"/>
+    <w:bookmarkStart w:id="60" w:name="controles-mínimos"/>
     <w:p>
       <w:pPr>
         <w:pStyle w:val="Heading3"/>
@@ -4859,7 +5394,7 @@
         <w:t xml:space="preserve">4.3 Controles Mínimos</w:t>
       </w:r>
     </w:p>
-    <w:bookmarkStart w:id="52" w:name="limites-e-triggers"/>
+    <w:bookmarkStart w:id="57" w:name="limites-e-triggers"/>
     <w:p>
       <w:pPr>
         <w:pStyle w:val="Heading4"/>
@@ -4942,8 +5477,8 @@
         <w:t xml:space="preserve">Taxa de renovação CDB           | &gt;75%      | &lt;78% → Aumentar remuneração</w:t>
       </w:r>
     </w:p>
-    <w:bookmarkEnd w:id="52"/>
-    <w:bookmarkStart w:id="53" w:name="governança"/>
+    <w:bookmarkEnd w:id="57"/>
+    <w:bookmarkStart w:id="58" w:name="governança"/>
     <w:p>
       <w:pPr>
         <w:pStyle w:val="Heading4"/>
@@ -5009,8 +5544,8 @@
         <w:t xml:space="preserve">: Acesso a redesconto, venda de carteira (FIDC)</w:t>
       </w:r>
     </w:p>
-    <w:bookmarkEnd w:id="53"/>
-    <w:bookmarkStart w:id="54" w:name="hedge-de-taxa"/>
+    <w:bookmarkEnd w:id="58"/>
+    <w:bookmarkStart w:id="59" w:name="hedge-de-taxa"/>
     <w:p>
       <w:pPr>
         <w:pStyle w:val="Heading4"/>
@@ -5043,9 +5578,9 @@
         <w:t xml:space="preserve">Mark-to-market mensal</w:t>
       </w:r>
     </w:p>
-    <w:bookmarkEnd w:id="54"/>
-    <w:bookmarkEnd w:id="55"/>
-    <w:bookmarkStart w:id="58" w:name="justificativa-prazo-e-custo"/>
+    <w:bookmarkEnd w:id="59"/>
+    <w:bookmarkEnd w:id="60"/>
+    <w:bookmarkStart w:id="63" w:name="justificativa-prazo-e-custo"/>
     <w:p>
       <w:pPr>
         <w:pStyle w:val="Heading3"/>
@@ -5054,7 +5589,7 @@
         <w:t xml:space="preserve">4.4 Justificativa Prazo e Custo</w:t>
       </w:r>
     </w:p>
-    <w:bookmarkStart w:id="56" w:name="prazo-31-meses-wal-ponderado"/>
+    <w:bookmarkStart w:id="61" w:name="prazo-31-meses-wal-ponderado"/>
     <w:p>
       <w:pPr>
         <w:pStyle w:val="Heading4"/>
@@ -5099,8 +5634,8 @@
         <w:t xml:space="preserve">4. Equilibra custo (prazo maior = juros mais altos) e estabilidade</w:t>
       </w:r>
     </w:p>
-    <w:bookmarkEnd w:id="56"/>
-    <w:bookmarkStart w:id="57" w:name="custo-141-a.a.-cdi-05-p.p.-ponderado"/>
+    <w:bookmarkEnd w:id="61"/>
+    <w:bookmarkStart w:id="62" w:name="custo-141-a.a.-cdi-05-p.p.-ponderado"/>
     <w:p>
       <w:pPr>
         <w:pStyle w:val="Heading4"/>
@@ -5209,10 +5744,10 @@
         </w:pict>
       </w:r>
     </w:p>
-    <w:bookmarkEnd w:id="57"/>
-    <w:bookmarkEnd w:id="58"/>
-    <w:bookmarkEnd w:id="59"/>
-    <w:bookmarkStart w:id="74" w:name="parte-5-npd-new-product-development"/>
+    <w:bookmarkEnd w:id="62"/>
+    <w:bookmarkEnd w:id="63"/>
+    <w:bookmarkEnd w:id="64"/>
+    <w:bookmarkStart w:id="79" w:name="parte-5-npd-new-product-development"/>
     <w:p>
       <w:pPr>
         <w:pStyle w:val="Heading2"/>
@@ -5221,7 +5756,7 @@
         <w:t xml:space="preserve">PARTE 5 – NPD (NEW PRODUCT DEVELOPMENT)</w:t>
       </w:r>
     </w:p>
-    <w:bookmarkStart w:id="60" w:name="X83c6dcc45b2835ecf1b56072434d842c4053863"/>
+    <w:bookmarkStart w:id="65" w:name="X83c6dcc45b2835ecf1b56072434d842c4053863"/>
     <w:p>
       <w:pPr>
         <w:pStyle w:val="Heading3"/>
@@ -5272,8 +5807,8 @@
         <w:t xml:space="preserve">- Risco baixo: Lastro garantido (saldo FGTS)</w:t>
       </w:r>
     </w:p>
-    <w:bookmarkEnd w:id="60"/>
-    <w:bookmarkStart w:id="66" w:name="stage-gate-0-a-4"/>
+    <w:bookmarkEnd w:id="65"/>
+    <w:bookmarkStart w:id="71" w:name="stage-gate-0-a-4"/>
     <w:p>
       <w:pPr>
         <w:pStyle w:val="Heading3"/>
@@ -5282,7 +5817,7 @@
         <w:t xml:space="preserve">5.2 Stage-Gate (0 a 4)</w:t>
       </w:r>
     </w:p>
-    <w:bookmarkStart w:id="61" w:name="gate-0-ideação"/>
+    <w:bookmarkStart w:id="66" w:name="gate-0-ideação"/>
     <w:p>
       <w:pPr>
         <w:pStyle w:val="Heading4"/>
@@ -5391,8 +5926,8 @@
         </w:pict>
       </w:r>
     </w:p>
-    <w:bookmarkEnd w:id="61"/>
-    <w:bookmarkStart w:id="62" w:name="gate-1-descoberta"/>
+    <w:bookmarkEnd w:id="66"/>
+    <w:bookmarkStart w:id="67" w:name="gate-1-descoberta"/>
     <w:p>
       <w:pPr>
         <w:pStyle w:val="Heading4"/>
@@ -5777,8 +6312,8 @@
         </w:pict>
       </w:r>
     </w:p>
-    <w:bookmarkEnd w:id="62"/>
-    <w:bookmarkStart w:id="63" w:name="gate-2-desenvolvimento"/>
+    <w:bookmarkEnd w:id="67"/>
+    <w:bookmarkStart w:id="68" w:name="gate-2-desenvolvimento"/>
     <w:p>
       <w:pPr>
         <w:pStyle w:val="Heading4"/>
@@ -6057,8 +6592,8 @@
         </w:pict>
       </w:r>
     </w:p>
-    <w:bookmarkEnd w:id="63"/>
-    <w:bookmarkStart w:id="64" w:name="gate-3-teste-pilot"/>
+    <w:bookmarkEnd w:id="68"/>
+    <w:bookmarkStart w:id="69" w:name="gate-3-teste-pilot"/>
     <w:p>
       <w:pPr>
         <w:pStyle w:val="Heading4"/>
@@ -6333,8 +6868,8 @@
         </w:pict>
       </w:r>
     </w:p>
-    <w:bookmarkEnd w:id="64"/>
-    <w:bookmarkStart w:id="65" w:name="gate-4-lançamento-scale-up"/>
+    <w:bookmarkEnd w:id="69"/>
+    <w:bookmarkStart w:id="70" w:name="gate-4-lançamento-scale-up"/>
     <w:p>
       <w:pPr>
         <w:pStyle w:val="Heading4"/>
@@ -6607,9 +7142,9 @@
         </w:pict>
       </w:r>
     </w:p>
-    <w:bookmarkEnd w:id="65"/>
-    <w:bookmarkEnd w:id="66"/>
-    <w:bookmarkStart w:id="67" w:name="unit-economics-detalhado"/>
+    <w:bookmarkEnd w:id="70"/>
+    <w:bookmarkEnd w:id="71"/>
+    <w:bookmarkStart w:id="72" w:name="unit-economics-detalhado"/>
     <w:p>
       <w:pPr>
         <w:pStyle w:val="Heading3"/>
@@ -6812,8 +7347,8 @@
         <w:t xml:space="preserve">LTV / CAC:                                 2,2x ✓</w:t>
       </w:r>
     </w:p>
-    <w:bookmarkEnd w:id="67"/>
-    <w:bookmarkStart w:id="68" w:name="kpis-e-kris"/>
+    <w:bookmarkEnd w:id="72"/>
+    <w:bookmarkStart w:id="73" w:name="kpis-e-kris"/>
     <w:p>
       <w:pPr>
         <w:pStyle w:val="Heading3"/>
@@ -7430,8 +7965,8 @@
         </w:tc>
       </w:tr>
     </w:tbl>
-    <w:bookmarkEnd w:id="68"/>
-    <w:bookmarkStart w:id="72" w:name="plano-306090-dias"/>
+    <w:bookmarkEnd w:id="73"/>
+    <w:bookmarkStart w:id="77" w:name="plano-306090-dias"/>
     <w:p>
       <w:pPr>
         <w:pStyle w:val="Heading3"/>
@@ -7440,7 +7975,7 @@
         <w:t xml:space="preserve">5.5 Plano 30/60/90 Dias</w:t>
       </w:r>
     </w:p>
-    <w:bookmarkStart w:id="69" w:name="dias-1-30-escalar-operação"/>
+    <w:bookmarkStart w:id="74" w:name="dias-1-30-escalar-operação"/>
     <w:p>
       <w:pPr>
         <w:pStyle w:val="Heading4"/>
@@ -7516,8 +8051,8 @@
         <w:t xml:space="preserve">: 800 operações, R$ 2,8 mi</w:t>
       </w:r>
     </w:p>
-    <w:bookmarkEnd w:id="69"/>
-    <w:bookmarkStart w:id="70" w:name="dias-31-60-otimizar-conversão"/>
+    <w:bookmarkEnd w:id="74"/>
+    <w:bookmarkStart w:id="75" w:name="dias-31-60-otimizar-conversão"/>
     <w:p>
       <w:pPr>
         <w:pStyle w:val="Heading4"/>
@@ -7587,8 +8122,8 @@
         <w:t xml:space="preserve">: 1.400 operações (+75%), R$ 5,0 mi</w:t>
       </w:r>
     </w:p>
-    <w:bookmarkEnd w:id="70"/>
-    <w:bookmarkStart w:id="71" w:name="dias-61-90-escalar-e-sustentar"/>
+    <w:bookmarkEnd w:id="75"/>
+    <w:bookmarkStart w:id="76" w:name="dias-61-90-escalar-e-sustentar"/>
     <w:p>
       <w:pPr>
         <w:pStyle w:val="Heading4"/>
@@ -7670,9 +8205,9 @@
         <w:t xml:space="preserve">Acumulado 90 dias: R$ 15,7 mi em volume, ~1.330 clientes ativos</w:t>
       </w:r>
     </w:p>
-    <w:bookmarkEnd w:id="71"/>
-    <w:bookmarkEnd w:id="72"/>
-    <w:bookmarkStart w:id="73" w:name="kill-switch"/>
+    <w:bookmarkEnd w:id="76"/>
+    <w:bookmarkEnd w:id="77"/>
+    <w:bookmarkStart w:id="78" w:name="kill-switch"/>
     <w:p>
       <w:pPr>
         <w:pStyle w:val="Heading3"/>
@@ -8205,9 +8740,9 @@
         </w:pict>
       </w:r>
     </w:p>
-    <w:bookmarkEnd w:id="73"/>
-    <w:bookmarkEnd w:id="74"/>
-    <w:bookmarkStart w:id="83" w:name="parte-6-uso-de-estruturas"/>
+    <w:bookmarkEnd w:id="78"/>
+    <w:bookmarkEnd w:id="79"/>
+    <w:bookmarkStart w:id="88" w:name="parte-6-uso-de-estruturas"/>
     <w:p>
       <w:pPr>
         <w:pStyle w:val="Heading2"/>
@@ -8216,7 +8751,7 @@
         <w:t xml:space="preserve">PARTE 6 – USO DE ESTRUTURAS</w:t>
       </w:r>
     </w:p>
-    <w:bookmarkStart w:id="78" w:name="análise-de-estruturas-financeiras"/>
+    <w:bookmarkStart w:id="83" w:name="análise-de-estruturas-financeiras"/>
     <w:p>
       <w:pPr>
         <w:pStyle w:val="Heading3"/>
@@ -8225,7 +8760,7 @@
         <w:t xml:space="preserve">6.1 Análise de Estruturas Financeiras</w:t>
       </w:r>
     </w:p>
-    <w:bookmarkStart w:id="75" w:name="X04df2a1e43119695c18f294fd282df8778a593b"/>
+    <w:bookmarkStart w:id="80" w:name="X04df2a1e43119695c18f294fd282df8778a593b"/>
     <w:p>
       <w:pPr>
         <w:pStyle w:val="Heading4"/>
@@ -8522,8 +9057,8 @@
         </w:pict>
       </w:r>
     </w:p>
-    <w:bookmarkEnd w:id="75"/>
-    <w:bookmarkStart w:id="76" w:name="b-debênture-securitizada"/>
+    <w:bookmarkEnd w:id="80"/>
+    <w:bookmarkStart w:id="81" w:name="b-debênture-securitizada"/>
     <w:p>
       <w:pPr>
         <w:pStyle w:val="Heading4"/>
@@ -8724,8 +9259,8 @@
         </w:pict>
       </w:r>
     </w:p>
-    <w:bookmarkEnd w:id="76"/>
-    <w:bookmarkStart w:id="77" w:name="c-resolução-4.131-emissão-externa"/>
+    <w:bookmarkEnd w:id="81"/>
+    <w:bookmarkStart w:id="82" w:name="c-resolução-4.131-emissão-externa"/>
     <w:p>
       <w:pPr>
         <w:pStyle w:val="Heading4"/>
@@ -9055,9 +9590,9 @@
         </w:pict>
       </w:r>
     </w:p>
-    <w:bookmarkEnd w:id="77"/>
-    <w:bookmarkEnd w:id="78"/>
-    <w:bookmarkStart w:id="82" w:name="recomendação-final---uso-de-estruturas"/>
+    <w:bookmarkEnd w:id="82"/>
+    <w:bookmarkEnd w:id="83"/>
+    <w:bookmarkStart w:id="87" w:name="recomendação-final---uso-de-estruturas"/>
     <w:p>
       <w:pPr>
         <w:pStyle w:val="Heading3"/>
@@ -9078,7 +9613,7 @@
         <w:t xml:space="preserve">ROADMAP PRIORIZADO:</w:t>
       </w:r>
     </w:p>
-    <w:bookmarkStart w:id="79" w:name="fase-1-meses-1-6-fidc-de-consignado"/>
+    <w:bookmarkStart w:id="84" w:name="fase-1-meses-1-6-fidc-de-consignado"/>
     <w:p>
       <w:pPr>
         <w:pStyle w:val="Heading4"/>
@@ -9127,8 +9662,8 @@
         <w:t xml:space="preserve">ROI: R$ 16 mi capital liberado + R$ 1,5 mi economia/ano</w:t>
       </w:r>
     </w:p>
-    <w:bookmarkEnd w:id="79"/>
-    <w:bookmarkStart w:id="80" w:name="X1b2e2f1a94b53dd5d7aaab7952e077547106196"/>
+    <w:bookmarkEnd w:id="84"/>
+    <w:bookmarkStart w:id="85" w:name="X1b2e2f1a94b53dd5d7aaab7952e077547106196"/>
     <w:p>
       <w:pPr>
         <w:pStyle w:val="Heading4"/>
@@ -9177,8 +9712,8 @@
         <w:t xml:space="preserve">Contingente: Apenas se swap BRL estiver abaixo de 5% a.a.</w:t>
       </w:r>
     </w:p>
-    <w:bookmarkEnd w:id="80"/>
-    <w:bookmarkStart w:id="81" w:name="fase-3-ano-2-fidc-multiportfolio"/>
+    <w:bookmarkEnd w:id="85"/>
+    <w:bookmarkStart w:id="86" w:name="fase-3-ano-2-fidc-multiportfolio"/>
     <w:p>
       <w:pPr>
         <w:pStyle w:val="Heading4"/>
@@ -9264,10 +9799,10 @@
         </w:pict>
       </w:r>
     </w:p>
-    <w:bookmarkEnd w:id="81"/>
-    <w:bookmarkEnd w:id="82"/>
-    <w:bookmarkEnd w:id="83"/>
-    <w:bookmarkStart w:id="87" w:name="integração-e-síntese-estratégica"/>
+    <w:bookmarkEnd w:id="86"/>
+    <w:bookmarkEnd w:id="87"/>
+    <w:bookmarkEnd w:id="88"/>
+    <w:bookmarkStart w:id="92" w:name="integração-e-síntese-estratégica"/>
     <w:p>
       <w:pPr>
         <w:pStyle w:val="Heading2"/>
@@ -9276,7 +9811,7 @@
         <w:t xml:space="preserve">INTEGRAÇÃO E SÍNTESE ESTRATÉGICA</w:t>
       </w:r>
     </w:p>
-    <w:bookmarkStart w:id="84" w:name="visão-consolidada-crescimento-de-r-1-bi"/>
+    <w:bookmarkStart w:id="89" w:name="visão-consolidada-crescimento-de-r-1-bi"/>
     <w:p>
       <w:pPr>
         <w:pStyle w:val="Heading3"/>
@@ -9713,8 +10248,8 @@
         <w:t xml:space="preserve">(vs 18,5% atual)</w:t>
       </w:r>
     </w:p>
-    <w:bookmarkEnd w:id="84"/>
-    <w:bookmarkStart w:id="85" w:name="mapa-de-risco-integrado"/>
+    <w:bookmarkEnd w:id="89"/>
+    <w:bookmarkStart w:id="90" w:name="mapa-de-risco-integrado"/>
     <w:p>
       <w:pPr>
         <w:pStyle w:val="Heading3"/>
@@ -9869,8 +10404,8 @@
         <w:t xml:space="preserve">            Baixo Retorno        Alto Retorno</w:t>
       </w:r>
     </w:p>
-    <w:bookmarkEnd w:id="85"/>
-    <w:bookmarkStart w:id="86" w:name="kpis-executivos-consolidados-mês-12"/>
+    <w:bookmarkEnd w:id="90"/>
+    <w:bookmarkStart w:id="91" w:name="kpis-executivos-consolidados-mês-12"/>
     <w:p>
       <w:pPr>
         <w:pStyle w:val="Heading3"/>
@@ -10253,15 +10788,24 @@
         </w:pict>
       </w:r>
     </w:p>
-    <w:bookmarkEnd w:id="86"/>
-    <w:bookmarkEnd w:id="87"/>
-    <w:bookmarkStart w:id="88" w:name="conclusão"/>
+    <w:bookmarkEnd w:id="91"/>
+    <w:bookmarkEnd w:id="92"/>
+    <w:bookmarkStart w:id="96" w:name="roadmap-de-implementação"/>
     <w:p>
       <w:pPr>
         <w:pStyle w:val="Heading2"/>
       </w:pPr>
       <w:r>
-        <w:t xml:space="preserve">CONCLUSÃO</w:t>
+        <w:t xml:space="preserve">ROADMAP DE IMPLEMENTAÇÃO</w:t>
+      </w:r>
+    </w:p>
+    <w:bookmarkStart w:id="93" w:name="cronograma-executivo-12-meses"/>
+    <w:p>
+      <w:pPr>
+        <w:pStyle w:val="Heading3"/>
+      </w:pPr>
+      <w:r>
+        <w:t xml:space="preserve">Cronograma Executivo (12 Meses)</w:t>
       </w:r>
     </w:p>
     <w:p>
@@ -10269,23 +10813,703 @@
         <w:pStyle w:val="FirstParagraph"/>
       </w:pPr>
       <w:r>
-        <w:t xml:space="preserve">Este plano estratégico propõe crescimento</w:t>
-      </w:r>
-      <w:r>
-        <w:t xml:space="preserve"> </w:t>
-      </w:r>
-      <w:r>
-        <w:rPr>
-          <w:bCs/>
-          <w:b/>
-        </w:rPr>
-        <w:t xml:space="preserve">sustentável e disciplinado</w:t>
-      </w:r>
-      <w:r>
-        <w:t xml:space="preserve"> </w:t>
-      </w:r>
-      <w:r>
-        <w:t xml:space="preserve">de R$ 1,0 bi na carteira PF através de:</w:t>
+        <w:rPr>
+          <w:bCs/>
+          <w:b/>
+        </w:rPr>
+        <w:t xml:space="preserve">FASE 1 - FUNDAÇÕES (Meses 1-3)</w:t>
+      </w:r>
+    </w:p>
+    <w:p>
+      <w:pPr>
+        <w:pStyle w:val="BodyText"/>
+      </w:pPr>
+      <w:r>
+        <w:t xml:space="preserve">Objetivo: Estabelecer bases para crescimento</w:t>
+      </w:r>
+    </w:p>
+    <w:p>
+      <w:pPr>
+        <w:pStyle w:val="BodyText"/>
+      </w:pPr>
+      <w:r>
+        <w:rPr>
+          <w:bCs/>
+          <w:b/>
+        </w:rPr>
+        <w:t xml:space="preserve">Principais iniciativas:</w:t>
+      </w:r>
+      <w:r>
+        <w:t xml:space="preserve"> </w:t>
+      </w:r>
+      <w:r>
+        <w:t xml:space="preserve">- Setup de governança (Comitê Estratégico PF semanal)</w:t>
+      </w:r>
+      <w:r>
+        <w:t xml:space="preserve"> </w:t>
+      </w:r>
+      <w:r>
+        <w:t xml:space="preserve">- Revisão de política de crédito (5 faixas de score)</w:t>
+      </w:r>
+      <w:r>
+        <w:t xml:space="preserve"> </w:t>
+      </w:r>
+      <w:r>
+        <w:t xml:space="preserve">- Integração open banking (fase 2)</w:t>
+      </w:r>
+      <w:r>
+        <w:t xml:space="preserve"> </w:t>
+      </w:r>
+      <w:r>
+        <w:t xml:space="preserve">- Piloto consignado privado (3 empresas, 5k funcionários)</w:t>
+      </w:r>
+      <w:r>
+        <w:t xml:space="preserve"> </w:t>
+      </w:r>
+      <w:r>
+        <w:t xml:space="preserve">- Desenvolvimento seguro opt-in</w:t>
+      </w:r>
+    </w:p>
+    <w:p>
+      <w:pPr>
+        <w:pStyle w:val="BodyText"/>
+      </w:pPr>
+      <w:r>
+        <w:rPr>
+          <w:bCs/>
+          <w:b/>
+        </w:rPr>
+        <w:t xml:space="preserve">Investimento:</w:t>
+      </w:r>
+      <w:r>
+        <w:t xml:space="preserve"> </w:t>
+      </w:r>
+      <w:r>
+        <w:t xml:space="preserve">R$ 2,5 mi |</w:t>
+      </w:r>
+      <w:r>
+        <w:t xml:space="preserve"> </w:t>
+      </w:r>
+      <w:r>
+        <w:rPr>
+          <w:bCs/>
+          <w:b/>
+        </w:rPr>
+        <w:t xml:space="preserve">Volume:</w:t>
+      </w:r>
+      <w:r>
+        <w:t xml:space="preserve"> </w:t>
+      </w:r>
+      <w:r>
+        <w:t xml:space="preserve">R$ 190 mi |</w:t>
+      </w:r>
+      <w:r>
+        <w:t xml:space="preserve"> </w:t>
+      </w:r>
+      <w:r>
+        <w:rPr>
+          <w:bCs/>
+          <w:b/>
+        </w:rPr>
+        <w:t xml:space="preserve">Carteira:</w:t>
+      </w:r>
+      <w:r>
+        <w:t xml:space="preserve"> </w:t>
+      </w:r>
+      <w:r>
+        <w:t xml:space="preserve">R$ 2,49 bi</w:t>
+      </w:r>
+    </w:p>
+    <w:p>
+      <w:r>
+        <w:pict>
+          <v:rect style="width:0;height:1.5pt" o:hralign="center" o:hrstd="t" o:hr="t"/>
+        </w:pict>
+      </w:r>
+    </w:p>
+    <w:p>
+      <w:pPr>
+        <w:pStyle w:val="FirstParagraph"/>
+      </w:pPr>
+      <w:r>
+        <w:rPr>
+          <w:bCs/>
+          <w:b/>
+        </w:rPr>
+        <w:t xml:space="preserve">FASE 2 - ACELERAÇÃO (Meses 4-8)</w:t>
+      </w:r>
+    </w:p>
+    <w:p>
+      <w:pPr>
+        <w:pStyle w:val="BodyText"/>
+      </w:pPr>
+      <w:r>
+        <w:t xml:space="preserve">Objetivo: Escalar volume com qualidade</w:t>
+      </w:r>
+    </w:p>
+    <w:p>
+      <w:pPr>
+        <w:pStyle w:val="BodyText"/>
+      </w:pPr>
+      <w:r>
+        <w:rPr>
+          <w:bCs/>
+          <w:b/>
+        </w:rPr>
+        <w:t xml:space="preserve">Principais iniciativas:</w:t>
+      </w:r>
+      <w:r>
+        <w:t xml:space="preserve"> </w:t>
+      </w:r>
+      <w:r>
+        <w:t xml:space="preserve">- Expansão consignado (adicionar 15 empresas, 30k funcionários)</w:t>
+      </w:r>
+      <w:r>
+        <w:t xml:space="preserve"> </w:t>
+      </w:r>
+      <w:r>
+        <w:t xml:space="preserve">- Lançamento app renovado + pricing dinâmico</w:t>
+      </w:r>
+      <w:r>
+        <w:t xml:space="preserve"> </w:t>
+      </w:r>
+      <w:r>
+        <w:t xml:space="preserve">- Lançamento seguro prestamista (taxa de adesão: 38%)</w:t>
+      </w:r>
+      <w:r>
+        <w:t xml:space="preserve"> </w:t>
+      </w:r>
+      <w:r>
+        <w:t xml:space="preserve">- Emissão DPGE2: R$ 300 mi (prazo 36 meses)</w:t>
+      </w:r>
+      <w:r>
+        <w:t xml:space="preserve"> </w:t>
+      </w:r>
+      <w:r>
+        <w:t xml:space="preserve">- Launch NPD FGTS Digital (lançamento nacional)</w:t>
+      </w:r>
+    </w:p>
+    <w:p>
+      <w:pPr>
+        <w:pStyle w:val="BodyText"/>
+      </w:pPr>
+      <w:r>
+        <w:rPr>
+          <w:bCs/>
+          <w:b/>
+        </w:rPr>
+        <w:t xml:space="preserve">Investimento:</w:t>
+      </w:r>
+      <w:r>
+        <w:t xml:space="preserve"> </w:t>
+      </w:r>
+      <w:r>
+        <w:t xml:space="preserve">R$ 15,0 mi |</w:t>
+      </w:r>
+      <w:r>
+        <w:t xml:space="preserve"> </w:t>
+      </w:r>
+      <w:r>
+        <w:rPr>
+          <w:bCs/>
+          <w:b/>
+        </w:rPr>
+        <w:t xml:space="preserve">Volume:</w:t>
+      </w:r>
+      <w:r>
+        <w:t xml:space="preserve"> </w:t>
+      </w:r>
+      <w:r>
+        <w:t xml:space="preserve">R$ 560 mi |</w:t>
+      </w:r>
+      <w:r>
+        <w:t xml:space="preserve"> </w:t>
+      </w:r>
+      <w:r>
+        <w:rPr>
+          <w:bCs/>
+          <w:b/>
+        </w:rPr>
+        <w:t xml:space="preserve">Carteira:</w:t>
+      </w:r>
+      <w:r>
+        <w:t xml:space="preserve"> </w:t>
+      </w:r>
+      <w:r>
+        <w:t xml:space="preserve">R$ 3,05 bi</w:t>
+      </w:r>
+    </w:p>
+    <w:p>
+      <w:r>
+        <w:pict>
+          <v:rect style="width:0;height:1.5pt" o:hralign="center" o:hrstd="t" o:hr="t"/>
+        </w:pict>
+      </w:r>
+    </w:p>
+    <w:p>
+      <w:pPr>
+        <w:pStyle w:val="FirstParagraph"/>
+      </w:pPr>
+      <w:r>
+        <w:rPr>
+          <w:bCs/>
+          <w:b/>
+        </w:rPr>
+        <w:t xml:space="preserve">FASE 3 - CONSOLIDAÇÃO (Meses 9-12)</w:t>
+      </w:r>
+    </w:p>
+    <w:p>
+      <w:pPr>
+        <w:pStyle w:val="BodyText"/>
+      </w:pPr>
+      <w:r>
+        <w:t xml:space="preserve">Objetivo: Atingir meta e sustentar crescimento</w:t>
+      </w:r>
+    </w:p>
+    <w:p>
+      <w:pPr>
+        <w:pStyle w:val="BodyText"/>
+      </w:pPr>
+      <w:r>
+        <w:rPr>
+          <w:bCs/>
+          <w:b/>
+        </w:rPr>
+        <w:t xml:space="preserve">Principais iniciativas:</w:t>
+      </w:r>
+      <w:r>
+        <w:t xml:space="preserve"> </w:t>
+      </w:r>
+      <w:r>
+        <w:t xml:space="preserve">- Aceleração FGTS Digital (1.500 ops/mês)</w:t>
+      </w:r>
+      <w:r>
+        <w:t xml:space="preserve"> </w:t>
+      </w:r>
+      <w:r>
+        <w:t xml:space="preserve">- Estruturação FIDC consignado (R$ 500 mi)</w:t>
+      </w:r>
+      <w:r>
+        <w:t xml:space="preserve"> </w:t>
+      </w:r>
+      <w:r>
+        <w:t xml:space="preserve">- Cashback program (retenção)</w:t>
+      </w:r>
+      <w:r>
+        <w:t xml:space="preserve"> </w:t>
+      </w:r>
+      <w:r>
+        <w:t xml:space="preserve">- Refinanciamento automático</w:t>
+      </w:r>
+    </w:p>
+    <w:p>
+      <w:pPr>
+        <w:pStyle w:val="BodyText"/>
+      </w:pPr>
+      <w:r>
+        <w:rPr>
+          <w:bCs/>
+          <w:b/>
+        </w:rPr>
+        <w:t xml:space="preserve">Investimento:</w:t>
+      </w:r>
+      <w:r>
+        <w:t xml:space="preserve"> </w:t>
+      </w:r>
+      <w:r>
+        <w:t xml:space="preserve">R$ 10,5 mi |</w:t>
+      </w:r>
+      <w:r>
+        <w:t xml:space="preserve"> </w:t>
+      </w:r>
+      <w:r>
+        <w:rPr>
+          <w:bCs/>
+          <w:b/>
+        </w:rPr>
+        <w:t xml:space="preserve">Volume:</w:t>
+      </w:r>
+      <w:r>
+        <w:t xml:space="preserve"> </w:t>
+      </w:r>
+      <w:r>
+        <w:t xml:space="preserve">R$ 250 mi |</w:t>
+      </w:r>
+      <w:r>
+        <w:t xml:space="preserve"> </w:t>
+      </w:r>
+      <w:r>
+        <w:rPr>
+          <w:bCs/>
+          <w:b/>
+        </w:rPr>
+        <w:t xml:space="preserve">Carteira:</w:t>
+      </w:r>
+      <w:r>
+        <w:t xml:space="preserve"> </w:t>
+      </w:r>
+      <w:r>
+        <w:t xml:space="preserve">R$ 3,30 bi ✅</w:t>
+      </w:r>
+    </w:p>
+    <w:p>
+      <w:r>
+        <w:pict>
+          <v:rect style="width:0;height:1.5pt" o:hralign="center" o:hrstd="t" o:hr="t"/>
+        </w:pict>
+      </w:r>
+    </w:p>
+    <w:bookmarkEnd w:id="93"/>
+    <w:bookmarkStart w:id="94" w:name="orçamento-consolidado"/>
+    <w:p>
+      <w:pPr>
+        <w:pStyle w:val="Heading3"/>
+      </w:pPr>
+      <w:r>
+        <w:t xml:space="preserve">Orçamento Consolidado</w:t>
+      </w:r>
+    </w:p>
+    <w:tbl>
+      <w:tblPr>
+        <w:tblStyle w:val="Table"/>
+        <w:tblW w:type="auto" w:w="0"/>
+        <w:tblLook w:firstRow="1" w:lastRow="0" w:firstColumn="0" w:lastColumn="0" w:noHBand="0" w:noVBand="0" w:val="0020"/>
+        <w:jc w:val="start"/>
+      </w:tblPr>
+      <w:tblGrid>
+        <w:gridCol w:w="2640"/>
+        <w:gridCol w:w="2640"/>
+        <w:gridCol w:w="2640"/>
+      </w:tblGrid>
+      <w:tr>
+        <w:trPr>
+          <w:tblHeader w:val="true"/>
+        </w:trPr>
+        <w:tc>
+          <w:tcPr/>
+          <w:p>
+            <w:pPr>
+              <w:pStyle w:val="Compact"/>
+              <w:jc w:val="left"/>
+            </w:pPr>
+            <w:r>
+              <w:t xml:space="preserve">Categoria</w:t>
+            </w:r>
+          </w:p>
+        </w:tc>
+        <w:tc>
+          <w:tcPr/>
+          <w:p>
+            <w:pPr>
+              <w:pStyle w:val="Compact"/>
+              <w:jc w:val="left"/>
+            </w:pPr>
+            <w:r>
+              <w:t xml:space="preserve">Investimento</w:t>
+            </w:r>
+          </w:p>
+        </w:tc>
+        <w:tc>
+          <w:tcPr/>
+          <w:p>
+            <w:pPr>
+              <w:pStyle w:val="Compact"/>
+              <w:jc w:val="left"/>
+            </w:pPr>
+            <w:r>
+              <w:t xml:space="preserve">%</w:t>
+            </w:r>
+          </w:p>
+        </w:tc>
+      </w:tr>
+      <w:tr>
+        <w:tc>
+          <w:tcPr/>
+          <w:p>
+            <w:pPr>
+              <w:pStyle w:val="Compact"/>
+              <w:jc w:val="left"/>
+            </w:pPr>
+            <w:r>
+              <w:t xml:space="preserve">Tecnologia</w:t>
+            </w:r>
+          </w:p>
+        </w:tc>
+        <w:tc>
+          <w:tcPr/>
+          <w:p>
+            <w:pPr>
+              <w:pStyle w:val="Compact"/>
+              <w:jc w:val="left"/>
+            </w:pPr>
+            <w:r>
+              <w:t xml:space="preserve">R$ 12,5 mi</w:t>
+            </w:r>
+          </w:p>
+        </w:tc>
+        <w:tc>
+          <w:tcPr/>
+          <w:p>
+            <w:pPr>
+              <w:pStyle w:val="Compact"/>
+              <w:jc w:val="left"/>
+            </w:pPr>
+            <w:r>
+              <w:t xml:space="preserve">45%</w:t>
+            </w:r>
+          </w:p>
+        </w:tc>
+      </w:tr>
+      <w:tr>
+        <w:tc>
+          <w:tcPr/>
+          <w:p>
+            <w:pPr>
+              <w:pStyle w:val="Compact"/>
+              <w:jc w:val="left"/>
+            </w:pPr>
+            <w:r>
+              <w:t xml:space="preserve">Marketing</w:t>
+            </w:r>
+          </w:p>
+        </w:tc>
+        <w:tc>
+          <w:tcPr/>
+          <w:p>
+            <w:pPr>
+              <w:pStyle w:val="Compact"/>
+              <w:jc w:val="left"/>
+            </w:pPr>
+            <w:r>
+              <w:t xml:space="preserve">R$ 8,2 mi</w:t>
+            </w:r>
+          </w:p>
+        </w:tc>
+        <w:tc>
+          <w:tcPr/>
+          <w:p>
+            <w:pPr>
+              <w:pStyle w:val="Compact"/>
+              <w:jc w:val="left"/>
+            </w:pPr>
+            <w:r>
+              <w:t xml:space="preserve">29%</w:t>
+            </w:r>
+          </w:p>
+        </w:tc>
+      </w:tr>
+      <w:tr>
+        <w:tc>
+          <w:tcPr/>
+          <w:p>
+            <w:pPr>
+              <w:pStyle w:val="Compact"/>
+              <w:jc w:val="left"/>
+            </w:pPr>
+            <w:r>
+              <w:t xml:space="preserve">Pessoas</w:t>
+            </w:r>
+          </w:p>
+        </w:tc>
+        <w:tc>
+          <w:tcPr/>
+          <w:p>
+            <w:pPr>
+              <w:pStyle w:val="Compact"/>
+              <w:jc w:val="left"/>
+            </w:pPr>
+            <w:r>
+              <w:t xml:space="preserve">R$ 4,8 mi</w:t>
+            </w:r>
+          </w:p>
+        </w:tc>
+        <w:tc>
+          <w:tcPr/>
+          <w:p>
+            <w:pPr>
+              <w:pStyle w:val="Compact"/>
+              <w:jc w:val="left"/>
+            </w:pPr>
+            <w:r>
+              <w:t xml:space="preserve">17%</w:t>
+            </w:r>
+          </w:p>
+        </w:tc>
+      </w:tr>
+      <w:tr>
+        <w:tc>
+          <w:tcPr/>
+          <w:p>
+            <w:pPr>
+              <w:pStyle w:val="Compact"/>
+              <w:jc w:val="left"/>
+            </w:pPr>
+            <w:r>
+              <w:t xml:space="preserve">Governança</w:t>
+            </w:r>
+          </w:p>
+        </w:tc>
+        <w:tc>
+          <w:tcPr/>
+          <w:p>
+            <w:pPr>
+              <w:pStyle w:val="Compact"/>
+              <w:jc w:val="left"/>
+            </w:pPr>
+            <w:r>
+              <w:t xml:space="preserve">R$ 2,5 mi</w:t>
+            </w:r>
+          </w:p>
+        </w:tc>
+        <w:tc>
+          <w:tcPr/>
+          <w:p>
+            <w:pPr>
+              <w:pStyle w:val="Compact"/>
+              <w:jc w:val="left"/>
+            </w:pPr>
+            <w:r>
+              <w:t xml:space="preserve">9%</w:t>
+            </w:r>
+          </w:p>
+        </w:tc>
+      </w:tr>
+      <w:tr>
+        <w:tc>
+          <w:tcPr/>
+          <w:p>
+            <w:pPr>
+              <w:pStyle w:val="Compact"/>
+              <w:jc w:val="left"/>
+            </w:pPr>
+            <w:r>
+              <w:rPr>
+                <w:bCs/>
+                <w:b/>
+              </w:rPr>
+              <w:t xml:space="preserve">TOTAL</w:t>
+            </w:r>
+          </w:p>
+        </w:tc>
+        <w:tc>
+          <w:tcPr/>
+          <w:p>
+            <w:pPr>
+              <w:pStyle w:val="Compact"/>
+              <w:jc w:val="left"/>
+            </w:pPr>
+            <w:r>
+              <w:rPr>
+                <w:bCs/>
+                <w:b/>
+              </w:rPr>
+              <w:t xml:space="preserve">R$ 28,0 mi</w:t>
+            </w:r>
+          </w:p>
+        </w:tc>
+        <w:tc>
+          <w:tcPr/>
+          <w:p>
+            <w:pPr>
+              <w:pStyle w:val="Compact"/>
+              <w:jc w:val="left"/>
+            </w:pPr>
+            <w:r>
+              <w:rPr>
+                <w:bCs/>
+                <w:b/>
+              </w:rPr>
+              <w:t xml:space="preserve">100%</w:t>
+            </w:r>
+          </w:p>
+        </w:tc>
+      </w:tr>
+    </w:tbl>
+    <w:p>
+      <w:pPr>
+        <w:pStyle w:val="BodyText"/>
+      </w:pPr>
+      <w:r>
+        <w:rPr>
+          <w:bCs/>
+          <w:b/>
+        </w:rPr>
+        <w:t xml:space="preserve">ROI:</w:t>
+      </w:r>
+      <w:r>
+        <w:t xml:space="preserve"> </w:t>
+      </w:r>
+      <w:r>
+        <w:t xml:space="preserve">96% no ano 1 |</w:t>
+      </w:r>
+      <w:r>
+        <w:t xml:space="preserve"> </w:t>
+      </w:r>
+      <w:r>
+        <w:rPr>
+          <w:bCs/>
+          <w:b/>
+        </w:rPr>
+        <w:t xml:space="preserve">Payback:</w:t>
+      </w:r>
+      <w:r>
+        <w:t xml:space="preserve"> </w:t>
+      </w:r>
+      <w:r>
+        <w:t xml:space="preserve">12,4 meses</w:t>
+      </w:r>
+    </w:p>
+    <w:p>
+      <w:r>
+        <w:pict>
+          <v:rect style="width:0;height:1.5pt" o:hralign="center" o:hrstd="t" o:hr="t"/>
+        </w:pict>
+      </w:r>
+    </w:p>
+    <w:bookmarkEnd w:id="94"/>
+    <w:bookmarkStart w:id="95" w:name="governança-e-riscos"/>
+    <w:p>
+      <w:pPr>
+        <w:pStyle w:val="Heading3"/>
+      </w:pPr>
+      <w:r>
+        <w:t xml:space="preserve">Governança e Riscos</w:t>
+      </w:r>
+    </w:p>
+    <w:p>
+      <w:pPr>
+        <w:pStyle w:val="FirstParagraph"/>
+      </w:pPr>
+      <w:r>
+        <w:rPr>
+          <w:bCs/>
+          <w:b/>
+        </w:rPr>
+        <w:t xml:space="preserve">Estrutura:</w:t>
+      </w:r>
+      <w:r>
+        <w:t xml:space="preserve"> </w:t>
+      </w:r>
+      <w:r>
+        <w:t xml:space="preserve">- Comitê Estratégico PF (semanal): CEO, CCO, CRO, CFO, CTO</w:t>
+      </w:r>
+      <w:r>
+        <w:t xml:space="preserve"> </w:t>
+      </w:r>
+      <w:r>
+        <w:t xml:space="preserve">- 4 Squads Ágeis: Crescimento, Experiência, Risco, Eficiência</w:t>
+      </w:r>
+    </w:p>
+    <w:p>
+      <w:pPr>
+        <w:pStyle w:val="BodyText"/>
+      </w:pPr>
+      <w:r>
+        <w:rPr>
+          <w:bCs/>
+          <w:b/>
+        </w:rPr>
+        <w:t xml:space="preserve">Top 3 Riscos e Mitigações:</w:t>
       </w:r>
     </w:p>
     <w:p>
@@ -10301,13 +11525,25 @@
           <w:bCs/>
           <w:b/>
         </w:rPr>
-        <w:t xml:space="preserve">Liderança do consignado</w:t>
-      </w:r>
-      <w:r>
-        <w:t xml:space="preserve"> </w:t>
-      </w:r>
-      <w:r>
-        <w:t xml:space="preserve">(menor risco, maior escala)</w:t>
+        <w:t xml:space="preserve">Risco de Execução</w:t>
+      </w:r>
+      <w:r>
+        <w:t xml:space="preserve"> </w:t>
+      </w:r>
+      <w:r>
+        <w:t xml:space="preserve">(Prob: Média | Impacto: Alto)</w:t>
+      </w:r>
+    </w:p>
+    <w:p>
+      <w:pPr>
+        <w:numPr>
+          <w:ilvl w:val="1"/>
+          <w:numId w:val="1020"/>
+        </w:numPr>
+        <w:pStyle w:val="Compact"/>
+      </w:pPr>
+      <w:r>
+        <w:t xml:space="preserve">Mitigação: Revisão mensal de pipeline, Plano B: portabilidade</w:t>
       </w:r>
     </w:p>
     <w:p>
@@ -10323,13 +11559,25 @@
           <w:bCs/>
           <w:b/>
         </w:rPr>
-        <w:t xml:space="preserve">Precificação baseada em risco</w:t>
-      </w:r>
-      <w:r>
-        <w:t xml:space="preserve"> </w:t>
-      </w:r>
-      <w:r>
-        <w:t xml:space="preserve">(segmentação em 5 faixas)</w:t>
+        <w:t xml:space="preserve">Risco de Inadimplência</w:t>
+      </w:r>
+      <w:r>
+        <w:t xml:space="preserve"> </w:t>
+      </w:r>
+      <w:r>
+        <w:t xml:space="preserve">(Prob: Média | Impacto: Alto)</w:t>
+      </w:r>
+    </w:p>
+    <w:p>
+      <w:pPr>
+        <w:numPr>
+          <w:ilvl w:val="1"/>
+          <w:numId w:val="1021"/>
+        </w:numPr>
+        <w:pStyle w:val="Compact"/>
+      </w:pPr>
+      <w:r>
+        <w:t xml:space="preserve">Mitigação: Tightening de crédito se NPL &gt; 5,5%</w:t>
       </w:r>
     </w:p>
     <w:p>
@@ -10345,97 +11593,25 @@
           <w:bCs/>
           <w:b/>
         </w:rPr>
-        <w:t xml:space="preserve">Monetização ética</w:t>
-      </w:r>
-      <w:r>
-        <w:t xml:space="preserve"> </w:t>
-      </w:r>
-      <w:r>
-        <w:t xml:space="preserve">(seguro opt-in com controles robustos)</w:t>
+        <w:t xml:space="preserve">Risco de Liquidez</w:t>
+      </w:r>
+      <w:r>
+        <w:t xml:space="preserve"> </w:t>
+      </w:r>
+      <w:r>
+        <w:t xml:space="preserve">(Prob: Baixa | Impacto: Alto)</w:t>
       </w:r>
     </w:p>
     <w:p>
       <w:pPr>
         <w:numPr>
-          <w:ilvl w:val="0"/>
-          <w:numId w:val="1019"/>
+          <w:ilvl w:val="1"/>
+          <w:numId w:val="1022"/>
         </w:numPr>
         <w:pStyle w:val="Compact"/>
       </w:pPr>
       <w:r>
-        <w:rPr>
-          <w:bCs/>
-          <w:b/>
-        </w:rPr>
-        <w:t xml:space="preserve">Funding otimizado</w:t>
-      </w:r>
-      <w:r>
-        <w:t xml:space="preserve"> </w:t>
-      </w:r>
-      <w:r>
-        <w:t xml:space="preserve">(mix CDB + DPGE2, custo 14,1%)</w:t>
-      </w:r>
-    </w:p>
-    <w:p>
-      <w:pPr>
-        <w:numPr>
-          <w:ilvl w:val="0"/>
-          <w:numId w:val="1019"/>
-        </w:numPr>
-        <w:pStyle w:val="Compact"/>
-      </w:pPr>
-      <w:r>
-        <w:rPr>
-          <w:bCs/>
-          <w:b/>
-        </w:rPr>
-        <w:t xml:space="preserve">Inovação com FGTS Digital</w:t>
-      </w:r>
-      <w:r>
-        <w:t xml:space="preserve"> </w:t>
-      </w:r>
-      <w:r>
-        <w:t xml:space="preserve">(LTV/CAC de 2,2x)</w:t>
-      </w:r>
-    </w:p>
-    <w:p>
-      <w:pPr>
-        <w:numPr>
-          <w:ilvl w:val="0"/>
-          <w:numId w:val="1019"/>
-        </w:numPr>
-        <w:pStyle w:val="Compact"/>
-      </w:pPr>
-      <w:r>
-        <w:rPr>
-          <w:bCs/>
-          <w:b/>
-        </w:rPr>
-        <w:t xml:space="preserve">Estruturas de capital</w:t>
-      </w:r>
-      <w:r>
-        <w:t xml:space="preserve"> </w:t>
-      </w:r>
-      <w:r>
-        <w:t xml:space="preserve">(FIDC libera R$ 16 mi)</w:t>
-      </w:r>
-    </w:p>
-    <w:p>
-      <w:pPr>
-        <w:pStyle w:val="FirstParagraph"/>
-      </w:pPr>
-      <w:r>
-        <w:rPr>
-          <w:bCs/>
-          <w:b/>
-        </w:rPr>
-        <w:t xml:space="preserve">Resultado esperado:</w:t>
-      </w:r>
-      <w:r>
-        <w:t xml:space="preserve"> </w:t>
-      </w:r>
-      <w:r>
-        <w:t xml:space="preserve">ROE de 22,3%, reclamações controladas (+11%), e crescimento sustentável com risco gerenciado.</w:t>
+        <w:t xml:space="preserve">Mitigação: Acelerar DPGE2, acesso a redesconto BCB</w:t>
       </w:r>
     </w:p>
     <w:p>
@@ -10445,46 +11621,189 @@
         </w:pict>
       </w:r>
     </w:p>
+    <w:bookmarkEnd w:id="95"/>
+    <w:bookmarkEnd w:id="96"/>
+    <w:bookmarkStart w:id="97" w:name="conclusão"/>
+    <w:p>
+      <w:pPr>
+        <w:pStyle w:val="Heading2"/>
+      </w:pPr>
+      <w:r>
+        <w:t xml:space="preserve">CONCLUSÃO</w:t>
+      </w:r>
+    </w:p>
     <w:p>
       <w:pPr>
         <w:pStyle w:val="FirstParagraph"/>
       </w:pPr>
       <w:r>
-        <w:rPr>
-          <w:bCs/>
-          <w:b/>
-        </w:rPr>
-        <w:t xml:space="preserve">Elaborado por:</w:t>
-      </w:r>
-      <w:r>
-        <w:br/>
-      </w:r>
-      <w:r>
-        <w:t xml:space="preserve">Head de Produtos PF</w:t>
-      </w:r>
-      <w:r>
-        <w:br/>
-      </w:r>
-      <w:r>
-        <w:t xml:space="preserve">[Nome do Aluno]</w:t>
-      </w:r>
-    </w:p>
-    <w:p>
-      <w:pPr>
-        <w:pStyle w:val="BodyText"/>
-      </w:pPr>
-      <w:r>
-        <w:rPr>
-          <w:bCs/>
-          <w:b/>
-        </w:rPr>
-        <w:t xml:space="preserve">Data:</w:t>
-      </w:r>
-      <w:r>
-        <w:t xml:space="preserve"> </w:t>
-      </w:r>
-      <w:r>
-        <w:t xml:space="preserve">[Data de Entrega]</w:t>
+        <w:t xml:space="preserve">Este plano estratégico propõe crescimento</w:t>
+      </w:r>
+      <w:r>
+        <w:t xml:space="preserve"> </w:t>
+      </w:r>
+      <w:r>
+        <w:rPr>
+          <w:bCs/>
+          <w:b/>
+        </w:rPr>
+        <w:t xml:space="preserve">sustentável e disciplinado</w:t>
+      </w:r>
+      <w:r>
+        <w:t xml:space="preserve"> </w:t>
+      </w:r>
+      <w:r>
+        <w:t xml:space="preserve">de R$ 1,0 bi na carteira PF através de:</w:t>
+      </w:r>
+    </w:p>
+    <w:p>
+      <w:pPr>
+        <w:numPr>
+          <w:ilvl w:val="0"/>
+          <w:numId w:val="1023"/>
+        </w:numPr>
+        <w:pStyle w:val="Compact"/>
+      </w:pPr>
+      <w:r>
+        <w:rPr>
+          <w:bCs/>
+          <w:b/>
+        </w:rPr>
+        <w:t xml:space="preserve">Liderança do consignado</w:t>
+      </w:r>
+      <w:r>
+        <w:t xml:space="preserve"> </w:t>
+      </w:r>
+      <w:r>
+        <w:t xml:space="preserve">(menor risco, maior escala)</w:t>
+      </w:r>
+    </w:p>
+    <w:p>
+      <w:pPr>
+        <w:numPr>
+          <w:ilvl w:val="0"/>
+          <w:numId w:val="1023"/>
+        </w:numPr>
+        <w:pStyle w:val="Compact"/>
+      </w:pPr>
+      <w:r>
+        <w:rPr>
+          <w:bCs/>
+          <w:b/>
+        </w:rPr>
+        <w:t xml:space="preserve">Precificação baseada em risco</w:t>
+      </w:r>
+      <w:r>
+        <w:t xml:space="preserve"> </w:t>
+      </w:r>
+      <w:r>
+        <w:t xml:space="preserve">(segmentação em 5 faixas)</w:t>
+      </w:r>
+    </w:p>
+    <w:p>
+      <w:pPr>
+        <w:numPr>
+          <w:ilvl w:val="0"/>
+          <w:numId w:val="1023"/>
+        </w:numPr>
+        <w:pStyle w:val="Compact"/>
+      </w:pPr>
+      <w:r>
+        <w:rPr>
+          <w:bCs/>
+          <w:b/>
+        </w:rPr>
+        <w:t xml:space="preserve">Monetização ética</w:t>
+      </w:r>
+      <w:r>
+        <w:t xml:space="preserve"> </w:t>
+      </w:r>
+      <w:r>
+        <w:t xml:space="preserve">(seguro opt-in com controles robustos)</w:t>
+      </w:r>
+    </w:p>
+    <w:p>
+      <w:pPr>
+        <w:numPr>
+          <w:ilvl w:val="0"/>
+          <w:numId w:val="1023"/>
+        </w:numPr>
+        <w:pStyle w:val="Compact"/>
+      </w:pPr>
+      <w:r>
+        <w:rPr>
+          <w:bCs/>
+          <w:b/>
+        </w:rPr>
+        <w:t xml:space="preserve">Funding otimizado</w:t>
+      </w:r>
+      <w:r>
+        <w:t xml:space="preserve"> </w:t>
+      </w:r>
+      <w:r>
+        <w:t xml:space="preserve">(mix CDB + DPGE2, custo 14,1%)</w:t>
+      </w:r>
+    </w:p>
+    <w:p>
+      <w:pPr>
+        <w:numPr>
+          <w:ilvl w:val="0"/>
+          <w:numId w:val="1023"/>
+        </w:numPr>
+        <w:pStyle w:val="Compact"/>
+      </w:pPr>
+      <w:r>
+        <w:rPr>
+          <w:bCs/>
+          <w:b/>
+        </w:rPr>
+        <w:t xml:space="preserve">Inovação com FGTS Digital</w:t>
+      </w:r>
+      <w:r>
+        <w:t xml:space="preserve"> </w:t>
+      </w:r>
+      <w:r>
+        <w:t xml:space="preserve">(LTV/CAC de 2,2x)</w:t>
+      </w:r>
+    </w:p>
+    <w:p>
+      <w:pPr>
+        <w:numPr>
+          <w:ilvl w:val="0"/>
+          <w:numId w:val="1023"/>
+        </w:numPr>
+        <w:pStyle w:val="Compact"/>
+      </w:pPr>
+      <w:r>
+        <w:rPr>
+          <w:bCs/>
+          <w:b/>
+        </w:rPr>
+        <w:t xml:space="preserve">Estruturas de capital</w:t>
+      </w:r>
+      <w:r>
+        <w:t xml:space="preserve"> </w:t>
+      </w:r>
+      <w:r>
+        <w:t xml:space="preserve">(FIDC libera R$ 16 mi)</w:t>
+      </w:r>
+    </w:p>
+    <w:p>
+      <w:pPr>
+        <w:pStyle w:val="FirstParagraph"/>
+      </w:pPr>
+      <w:r>
+        <w:rPr>
+          <w:bCs/>
+          <w:b/>
+        </w:rPr>
+        <w:t xml:space="preserve">Resultado esperado:</w:t>
+      </w:r>
+      <w:r>
+        <w:t xml:space="preserve"> </w:t>
+      </w:r>
+      <w:r>
+        <w:t xml:space="preserve">ROE de 22,3%, reclamações controladas (+11%), e crescimento sustentável com risco gerenciado.</w:t>
       </w:r>
     </w:p>
     <w:p>
@@ -10494,8 +11813,57 @@
         </w:pict>
       </w:r>
     </w:p>
-    <w:bookmarkEnd w:id="88"/>
-    <w:bookmarkStart w:id="92" w:name="anexos"/>
+    <w:p>
+      <w:pPr>
+        <w:pStyle w:val="FirstParagraph"/>
+      </w:pPr>
+      <w:r>
+        <w:rPr>
+          <w:bCs/>
+          <w:b/>
+        </w:rPr>
+        <w:t xml:space="preserve">Elaborado por:</w:t>
+      </w:r>
+      <w:r>
+        <w:br/>
+      </w:r>
+      <w:r>
+        <w:t xml:space="preserve">Head de Produtos PF</w:t>
+      </w:r>
+      <w:r>
+        <w:br/>
+      </w:r>
+      <w:r>
+        <w:t xml:space="preserve">[Nome do Aluno]</w:t>
+      </w:r>
+    </w:p>
+    <w:p>
+      <w:pPr>
+        <w:pStyle w:val="BodyText"/>
+      </w:pPr>
+      <w:r>
+        <w:rPr>
+          <w:bCs/>
+          <w:b/>
+        </w:rPr>
+        <w:t xml:space="preserve">Data:</w:t>
+      </w:r>
+      <w:r>
+        <w:t xml:space="preserve"> </w:t>
+      </w:r>
+      <w:r>
+        <w:t xml:space="preserve">[Data de Entrega]</w:t>
+      </w:r>
+    </w:p>
+    <w:p>
+      <w:r>
+        <w:pict>
+          <v:rect style="width:0;height:1.5pt" o:hralign="center" o:hrstd="t" o:hr="t"/>
+        </w:pict>
+      </w:r>
+    </w:p>
+    <w:bookmarkEnd w:id="97"/>
+    <w:bookmarkStart w:id="101" w:name="anexos"/>
     <w:p>
       <w:pPr>
         <w:pStyle w:val="Heading2"/>
@@ -10504,7 +11872,7 @@
         <w:t xml:space="preserve">ANEXOS</w:t>
       </w:r>
     </w:p>
-    <w:bookmarkStart w:id="89" w:name="anexo-a-glossário-de-termos"/>
+    <w:bookmarkStart w:id="98" w:name="anexo-a-glossário-de-termos"/>
     <w:p>
       <w:pPr>
         <w:pStyle w:val="Heading3"/>
@@ -10517,7 +11885,7 @@
       <w:pPr>
         <w:numPr>
           <w:ilvl w:val="0"/>
-          <w:numId w:val="1020"/>
+          <w:numId w:val="1024"/>
         </w:numPr>
         <w:pStyle w:val="Compact"/>
       </w:pPr>
@@ -10536,7 +11904,7 @@
       <w:pPr>
         <w:numPr>
           <w:ilvl w:val="0"/>
-          <w:numId w:val="1020"/>
+          <w:numId w:val="1024"/>
         </w:numPr>
         <w:pStyle w:val="Compact"/>
       </w:pPr>
@@ -10555,7 +11923,7 @@
       <w:pPr>
         <w:numPr>
           <w:ilvl w:val="0"/>
-          <w:numId w:val="1020"/>
+          <w:numId w:val="1024"/>
         </w:numPr>
         <w:pStyle w:val="Compact"/>
       </w:pPr>
@@ -10574,7 +11942,7 @@
       <w:pPr>
         <w:numPr>
           <w:ilvl w:val="0"/>
-          <w:numId w:val="1020"/>
+          <w:numId w:val="1024"/>
         </w:numPr>
         <w:pStyle w:val="Compact"/>
       </w:pPr>
@@ -10593,7 +11961,7 @@
       <w:pPr>
         <w:numPr>
           <w:ilvl w:val="0"/>
-          <w:numId w:val="1020"/>
+          <w:numId w:val="1024"/>
         </w:numPr>
         <w:pStyle w:val="Compact"/>
       </w:pPr>
@@ -10612,7 +11980,7 @@
       <w:pPr>
         <w:numPr>
           <w:ilvl w:val="0"/>
-          <w:numId w:val="1020"/>
+          <w:numId w:val="1024"/>
         </w:numPr>
         <w:pStyle w:val="Compact"/>
       </w:pPr>
@@ -10631,7 +11999,7 @@
       <w:pPr>
         <w:numPr>
           <w:ilvl w:val="0"/>
-          <w:numId w:val="1020"/>
+          <w:numId w:val="1024"/>
         </w:numPr>
         <w:pStyle w:val="Compact"/>
       </w:pPr>
@@ -10650,7 +12018,7 @@
       <w:pPr>
         <w:numPr>
           <w:ilvl w:val="0"/>
-          <w:numId w:val="1020"/>
+          <w:numId w:val="1024"/>
         </w:numPr>
         <w:pStyle w:val="Compact"/>
       </w:pPr>
@@ -10669,7 +12037,7 @@
       <w:pPr>
         <w:numPr>
           <w:ilvl w:val="0"/>
-          <w:numId w:val="1020"/>
+          <w:numId w:val="1024"/>
         </w:numPr>
         <w:pStyle w:val="Compact"/>
       </w:pPr>
@@ -10684,8 +12052,8 @@
         <w:t xml:space="preserve">: Prazo médio ponderado</w:t>
       </w:r>
     </w:p>
-    <w:bookmarkEnd w:id="89"/>
-    <w:bookmarkStart w:id="90" w:name="anexo-b-premissas-macroeconômicas"/>
+    <w:bookmarkEnd w:id="98"/>
+    <w:bookmarkStart w:id="99" w:name="anexo-b-premissas-macroeconômicas"/>
     <w:p>
       <w:pPr>
         <w:pStyle w:val="Heading3"/>
@@ -10698,7 +12066,7 @@
       <w:pPr>
         <w:numPr>
           <w:ilvl w:val="0"/>
-          <w:numId w:val="1021"/>
+          <w:numId w:val="1025"/>
         </w:numPr>
         <w:pStyle w:val="Compact"/>
       </w:pPr>
@@ -10710,7 +12078,7 @@
       <w:pPr>
         <w:numPr>
           <w:ilvl w:val="0"/>
-          <w:numId w:val="1021"/>
+          <w:numId w:val="1025"/>
         </w:numPr>
         <w:pStyle w:val="Compact"/>
       </w:pPr>
@@ -10722,7 +12090,7 @@
       <w:pPr>
         <w:numPr>
           <w:ilvl w:val="0"/>
-          <w:numId w:val="1021"/>
+          <w:numId w:val="1025"/>
         </w:numPr>
         <w:pStyle w:val="Compact"/>
       </w:pPr>
@@ -10734,7 +12102,7 @@
       <w:pPr>
         <w:numPr>
           <w:ilvl w:val="0"/>
-          <w:numId w:val="1021"/>
+          <w:numId w:val="1025"/>
         </w:numPr>
         <w:pStyle w:val="Compact"/>
       </w:pPr>
@@ -10746,7 +12114,7 @@
       <w:pPr>
         <w:numPr>
           <w:ilvl w:val="0"/>
-          <w:numId w:val="1021"/>
+          <w:numId w:val="1025"/>
         </w:numPr>
         <w:pStyle w:val="Compact"/>
       </w:pPr>
@@ -10754,8 +12122,8 @@
         <w:t xml:space="preserve">Selic meta: 11,75% a.a.</w:t>
       </w:r>
     </w:p>
-    <w:bookmarkEnd w:id="90"/>
-    <w:bookmarkStart w:id="91" w:name="anexo-c-referências-regulatórias"/>
+    <w:bookmarkEnd w:id="99"/>
+    <w:bookmarkStart w:id="100" w:name="anexo-c-referências-regulatórias"/>
     <w:p>
       <w:pPr>
         <w:pStyle w:val="Heading3"/>
@@ -10768,7 +12136,7 @@
       <w:pPr>
         <w:numPr>
           <w:ilvl w:val="0"/>
-          <w:numId w:val="1022"/>
+          <w:numId w:val="1026"/>
         </w:numPr>
         <w:pStyle w:val="Compact"/>
       </w:pPr>
@@ -10780,7 +12148,7 @@
       <w:pPr>
         <w:numPr>
           <w:ilvl w:val="0"/>
-          <w:numId w:val="1022"/>
+          <w:numId w:val="1026"/>
         </w:numPr>
         <w:pStyle w:val="Compact"/>
       </w:pPr>
@@ -10792,7 +12160,7 @@
       <w:pPr>
         <w:numPr>
           <w:ilvl w:val="0"/>
-          <w:numId w:val="1022"/>
+          <w:numId w:val="1026"/>
         </w:numPr>
         <w:pStyle w:val="Compact"/>
       </w:pPr>
@@ -10804,7 +12172,7 @@
       <w:pPr>
         <w:numPr>
           <w:ilvl w:val="0"/>
-          <w:numId w:val="1022"/>
+          <w:numId w:val="1026"/>
         </w:numPr>
         <w:pStyle w:val="Compact"/>
       </w:pPr>
@@ -10816,7 +12184,7 @@
       <w:pPr>
         <w:numPr>
           <w:ilvl w:val="0"/>
-          <w:numId w:val="1022"/>
+          <w:numId w:val="1026"/>
         </w:numPr>
         <w:pStyle w:val="Compact"/>
       </w:pPr>
@@ -10828,7 +12196,7 @@
       <w:pPr>
         <w:numPr>
           <w:ilvl w:val="0"/>
-          <w:numId w:val="1022"/>
+          <w:numId w:val="1026"/>
         </w:numPr>
         <w:pStyle w:val="Compact"/>
       </w:pPr>
@@ -10836,9 +12204,9 @@
         <w:t xml:space="preserve">Circular SUSEP 612/2020 (Seguros)</w:t>
       </w:r>
     </w:p>
-    <w:bookmarkEnd w:id="91"/>
-    <w:bookmarkEnd w:id="92"/>
-    <w:bookmarkEnd w:id="93"/>
+    <w:bookmarkEnd w:id="100"/>
+    <w:bookmarkEnd w:id="101"/>
+    <w:bookmarkEnd w:id="102"/>
     <w:sectPr/>
   </w:body>
 </w:document>
@@ -11393,6 +12761,45 @@
     <w:abstractNumId w:val="991"/>
   </w:num>
   <w:num w:numId="1022">
+    <w:abstractNumId w:val="991"/>
+  </w:num>
+  <w:num w:numId="1023">
+    <w:abstractNumId w:val="99411"/>
+    <w:lvlOverride w:ilvl="0">
+      <w:startOverride w:val="1"/>
+    </w:lvlOverride>
+    <w:lvlOverride w:ilvl="1">
+      <w:startOverride w:val="1"/>
+    </w:lvlOverride>
+    <w:lvlOverride w:ilvl="2">
+      <w:startOverride w:val="1"/>
+    </w:lvlOverride>
+    <w:lvlOverride w:ilvl="3">
+      <w:startOverride w:val="1"/>
+    </w:lvlOverride>
+    <w:lvlOverride w:ilvl="4">
+      <w:startOverride w:val="1"/>
+    </w:lvlOverride>
+    <w:lvlOverride w:ilvl="5">
+      <w:startOverride w:val="1"/>
+    </w:lvlOverride>
+    <w:lvlOverride w:ilvl="6">
+      <w:startOverride w:val="1"/>
+    </w:lvlOverride>
+    <w:lvlOverride w:ilvl="7">
+      <w:startOverride w:val="1"/>
+    </w:lvlOverride>
+    <w:lvlOverride w:ilvl="8">
+      <w:startOverride w:val="1"/>
+    </w:lvlOverride>
+  </w:num>
+  <w:num w:numId="1024">
+    <w:abstractNumId w:val="991"/>
+  </w:num>
+  <w:num w:numId="1025">
+    <w:abstractNumId w:val="991"/>
+  </w:num>
+  <w:num w:numId="1026">
     <w:abstractNumId w:val="991"/>
   </w:num>
 </w:numbering>

</xml_diff>